<commit_message>
Update BSCS 7B Assignment 4 docx
Modify the Word document 'BSCS 7B/Professioanl Prctices/Assignment 4.docx'. This is a binary (.docx) change so no textual diff is available; the document content or formatting was updated.
</commit_message>
<xml_diff>
--- a/BSCS 7B/Professioanl Prctices/Assignment 4.docx
+++ b/BSCS 7B/Professioanl Prctices/Assignment 4.docx
@@ -1,6 +1,6 @@
 
 <file path=word/document.xml><?xml version="1.0" encoding="utf-8"?>
-<w:document xmlns:wpc="http://schemas.microsoft.com/office/word/2010/wordprocessingCanvas" xmlns:cx="http://schemas.microsoft.com/office/drawing/2014/chartex" xmlns:mc="http://schemas.openxmlformats.org/markup-compatibility/2006" xmlns:o="urn:schemas-microsoft-com:office:office" xmlns:r="http://schemas.openxmlformats.org/officeDocument/2006/relationships" xmlns:m="http://schemas.openxmlformats.org/officeDocument/2006/math" xmlns:v="urn:schemas-microsoft-com:vml" xmlns:wp14="http://schemas.microsoft.com/office/word/2010/wordprocessingDrawing" xmlns:wp="http://schemas.openxmlformats.org/drawingml/2006/wordprocessingDrawing" xmlns:w10="urn:schemas-microsoft-com:office:word" xmlns:w="http://schemas.openxmlformats.org/wordprocessingml/2006/main" xmlns:w14="http://schemas.microsoft.com/office/word/2010/wordml" xmlns:w15="http://schemas.microsoft.com/office/word/2012/wordml" xmlns:w16se="http://schemas.microsoft.com/office/word/2015/wordml/symex" xmlns:wpg="http://schemas.microsoft.com/office/word/2010/wordprocessingGroup" xmlns:wpi="http://schemas.microsoft.com/office/word/2010/wordprocessingInk" xmlns:wne="http://schemas.microsoft.com/office/word/2006/wordml" xmlns:wps="http://schemas.microsoft.com/office/word/2010/wordprocessingShape" mc:Ignorable="w14 w15 w16se wp14">
+<w:document xmlns:wpc="http://schemas.microsoft.com/office/word/2010/wordprocessingCanvas" xmlns:cx="http://schemas.microsoft.com/office/drawing/2014/chartex" xmlns:cx1="http://schemas.microsoft.com/office/drawing/2015/9/8/chartex" xmlns:cx2="http://schemas.microsoft.com/office/drawing/2015/10/21/chartex" xmlns:cx3="http://schemas.microsoft.com/office/drawing/2016/5/9/chartex" xmlns:cx4="http://schemas.microsoft.com/office/drawing/2016/5/10/chartex" xmlns:cx5="http://schemas.microsoft.com/office/drawing/2016/5/11/chartex" xmlns:cx6="http://schemas.microsoft.com/office/drawing/2016/5/12/chartex" xmlns:cx7="http://schemas.microsoft.com/office/drawing/2016/5/13/chartex" xmlns:cx8="http://schemas.microsoft.com/office/drawing/2016/5/14/chartex" xmlns:mc="http://schemas.openxmlformats.org/markup-compatibility/2006" xmlns:aink="http://schemas.microsoft.com/office/drawing/2016/ink" xmlns:am3d="http://schemas.microsoft.com/office/drawing/2017/model3d" xmlns:o="urn:schemas-microsoft-com:office:office" xmlns:oel="http://schemas.microsoft.com/office/2019/extlst" xmlns:r="http://schemas.openxmlformats.org/officeDocument/2006/relationships" xmlns:m="http://schemas.openxmlformats.org/officeDocument/2006/math" xmlns:v="urn:schemas-microsoft-com:vml" xmlns:wp14="http://schemas.microsoft.com/office/word/2010/wordprocessingDrawing" xmlns:wp="http://schemas.openxmlformats.org/drawingml/2006/wordprocessingDrawing" xmlns:w10="urn:schemas-microsoft-com:office:word" xmlns:w="http://schemas.openxmlformats.org/wordprocessingml/2006/main" xmlns:w14="http://schemas.microsoft.com/office/word/2010/wordml" xmlns:w15="http://schemas.microsoft.com/office/word/2012/wordml" xmlns:w16cex="http://schemas.microsoft.com/office/word/2018/wordml/cex" xmlns:w16cid="http://schemas.microsoft.com/office/word/2016/wordml/cid" xmlns:w16="http://schemas.microsoft.com/office/word/2018/wordml" xmlns:w16du="http://schemas.microsoft.com/office/word/2023/wordml/word16du" xmlns:w16sdtdh="http://schemas.microsoft.com/office/word/2020/wordml/sdtdatahash" xmlns:w16sdtfl="http://schemas.microsoft.com/office/word/2024/wordml/sdtformatlock" xmlns:w16se="http://schemas.microsoft.com/office/word/2015/wordml/symex" xmlns:wpg="http://schemas.microsoft.com/office/word/2010/wordprocessingGroup" xmlns:wpi="http://schemas.microsoft.com/office/word/2010/wordprocessingInk" xmlns:wne="http://schemas.microsoft.com/office/word/2006/wordml" xmlns:wps="http://schemas.microsoft.com/office/word/2010/wordprocessingShape" mc:Ignorable="w14 w15 w16se w16cid w16 w16cex w16sdtdh w16sdtfl w16du wp14">
   <w:body>
     <w:p>
       <w:pPr>
@@ -32,7 +32,7 @@
           <w:tab w:val="left" w:pos="-360"/>
         </w:tabs>
         <w:ind w:left="-360"/>
-        <w:jc w:val="right"/>
+        <w:jc w:val="center"/>
         <w:rPr>
           <w:rFonts w:ascii="Times New Roman" w:hAnsi="Times New Roman"/>
           <w:b/>
@@ -48,7 +48,7 @@
           <w:sz w:val="32"/>
           <w:lang w:val="en-GB"/>
         </w:rPr>
-        <w:t>Total Marks</w:t>
+        <w:tab/>
       </w:r>
       <w:r>
         <w:rPr>
@@ -57,7 +57,7 @@
           <w:sz w:val="32"/>
           <w:lang w:val="en-GB"/>
         </w:rPr>
-        <w:t xml:space="preserve">:   </w:t>
+        <w:tab/>
       </w:r>
       <w:r>
         <w:rPr>
@@ -66,6 +66,97 @@
           <w:sz w:val="32"/>
           <w:lang w:val="en-GB"/>
         </w:rPr>
+        <w:tab/>
+      </w:r>
+      <w:r>
+        <w:rPr>
+          <w:rFonts w:ascii="Times New Roman" w:hAnsi="Times New Roman"/>
+          <w:b/>
+          <w:sz w:val="32"/>
+          <w:lang w:val="en-GB"/>
+        </w:rPr>
+        <w:tab/>
+      </w:r>
+      <w:r>
+        <w:rPr>
+          <w:rFonts w:ascii="Times New Roman" w:hAnsi="Times New Roman"/>
+          <w:b/>
+          <w:sz w:val="32"/>
+          <w:lang w:val="en-GB"/>
+        </w:rPr>
+        <w:tab/>
+      </w:r>
+      <w:r>
+        <w:rPr>
+          <w:rFonts w:ascii="Times New Roman" w:hAnsi="Times New Roman"/>
+          <w:b/>
+          <w:sz w:val="32"/>
+          <w:lang w:val="en-GB"/>
+        </w:rPr>
+        <w:tab/>
+      </w:r>
+      <w:r>
+        <w:rPr>
+          <w:rFonts w:ascii="Times New Roman" w:hAnsi="Times New Roman"/>
+          <w:b/>
+          <w:sz w:val="32"/>
+          <w:lang w:val="en-GB"/>
+        </w:rPr>
+        <w:tab/>
+      </w:r>
+      <w:r>
+        <w:rPr>
+          <w:rFonts w:ascii="Times New Roman" w:hAnsi="Times New Roman"/>
+          <w:b/>
+          <w:sz w:val="32"/>
+          <w:lang w:val="en-GB"/>
+        </w:rPr>
+        <w:tab/>
+        <w:t xml:space="preserve">  </w:t>
+      </w:r>
+      <w:r>
+        <w:rPr>
+          <w:rFonts w:ascii="Times New Roman" w:hAnsi="Times New Roman"/>
+          <w:b/>
+          <w:sz w:val="32"/>
+          <w:lang w:val="en-GB"/>
+        </w:rPr>
+        <w:t>Total Marks</w:t>
+      </w:r>
+      <w:r>
+        <w:rPr>
+          <w:rFonts w:ascii="Times New Roman" w:hAnsi="Times New Roman"/>
+          <w:b/>
+          <w:sz w:val="32"/>
+          <w:lang w:val="en-GB"/>
+        </w:rPr>
+        <w:t>:</w:t>
+      </w:r>
+      <w:r>
+        <w:rPr>
+          <w:rFonts w:ascii="Times New Roman" w:hAnsi="Times New Roman"/>
+          <w:b/>
+          <w:sz w:val="32"/>
+          <w:lang w:val="en-GB"/>
+        </w:rPr>
+        <w:t xml:space="preserve">  </w:t>
+      </w:r>
+      <w:r>
+        <w:rPr>
+          <w:rFonts w:ascii="Times New Roman" w:hAnsi="Times New Roman"/>
+          <w:b/>
+          <w:sz w:val="32"/>
+          <w:lang w:val="en-GB"/>
+        </w:rPr>
+        <w:t xml:space="preserve">   </w:t>
+      </w:r>
+      <w:r>
+        <w:rPr>
+          <w:rFonts w:ascii="Times New Roman" w:hAnsi="Times New Roman"/>
+          <w:b/>
+          <w:sz w:val="32"/>
+          <w:lang w:val="en-GB"/>
+        </w:rPr>
         <w:t xml:space="preserve">  </w:t>
       </w:r>
     </w:p>
@@ -90,12 +181,12 @@
           <w:noProof/>
           <w:sz w:val="32"/>
         </w:rPr>
-        <w:pict>
+        <w:pict w14:anchorId="5BB35F02">
           <v:shapetype id="_x0000_t32" coordsize="21600,21600" o:spt="32" o:oned="t" path="m,l21600,21600e" filled="f">
             <v:path arrowok="t" fillok="f" o:connecttype="none"/>
             <o:lock v:ext="edit" shapetype="t"/>
           </v:shapetype>
-          <v:shape id="_x0000_s1026" type="#_x0000_t32" style="position:absolute;left:0;text-align:left;margin-left:442.5pt;margin-top:-.3pt;width:48pt;height:0;z-index:251658240" o:connectortype="straight"/>
+          <v:shape id="_x0000_s2050" type="#_x0000_t32" style="position:absolute;left:0;text-align:left;margin-left:442.5pt;margin-top:-.3pt;width:48pt;height:0;z-index:251658240" o:connectortype="straight"/>
         </w:pict>
       </w:r>
     </w:p>
@@ -120,8 +211,8 @@
           <w:noProof/>
           <w:sz w:val="32"/>
         </w:rPr>
-        <w:pict>
-          <v:shape id="_x0000_s1027" type="#_x0000_t32" style="position:absolute;left:0;text-align:left;margin-left:444.75pt;margin-top:12.05pt;width:48pt;height:0;z-index:251659264" o:connectortype="straight"/>
+        <w:pict w14:anchorId="0B50C19F">
+          <v:shape id="_x0000_s2051" type="#_x0000_t32" style="position:absolute;left:0;text-align:left;margin-left:444.75pt;margin-top:12.05pt;width:48pt;height:0;z-index:251659264" o:connectortype="straight"/>
         </w:pict>
       </w:r>
       <w:r>
@@ -399,7 +490,17 @@
           <w:szCs w:val="52"/>
           <w:u w:val="single"/>
         </w:rPr>
-        <w:t>Student Name: ___________________</w:t>
+        <w:t xml:space="preserve">Student Name: </w:t>
+      </w:r>
+      <w:r>
+        <w:rPr>
+          <w:rFonts w:ascii="Times New Roman" w:hAnsi="Times New Roman"/>
+          <w:b/>
+          <w:sz w:val="36"/>
+          <w:szCs w:val="52"/>
+          <w:u w:val="single"/>
+        </w:rPr>
+        <w:t>Ubaid Bin Waris</w:t>
       </w:r>
     </w:p>
     <w:p>
@@ -425,7 +526,17 @@
           <w:szCs w:val="52"/>
           <w:u w:val="single"/>
         </w:rPr>
-        <w:t>Student Reg. No.__________________</w:t>
+        <w:t>Student Reg. No.</w:t>
+      </w:r>
+      <w:r>
+        <w:rPr>
+          <w:rFonts w:ascii="Times New Roman" w:hAnsi="Times New Roman"/>
+          <w:b/>
+          <w:sz w:val="36"/>
+          <w:szCs w:val="52"/>
+          <w:u w:val="single"/>
+        </w:rPr>
+        <w:t xml:space="preserve"> 2212416</w:t>
       </w:r>
     </w:p>
     <w:p>
@@ -433,26 +544,7 @@
         <w:autoSpaceDE w:val="0"/>
         <w:autoSpaceDN w:val="0"/>
         <w:adjustRightInd w:val="0"/>
-        <w:spacing w:line="480" w:lineRule="auto"/>
         <w:jc w:val="center"/>
-        <w:rPr>
-          <w:rFonts w:ascii="Times New Roman" w:hAnsi="Times New Roman"/>
-          <w:b/>
-          <w:sz w:val="52"/>
-          <w:szCs w:val="52"/>
-          <w:u w:val="single"/>
-        </w:rPr>
-      </w:pPr>
-      <w:r>
-        <w:rPr>
-          <w:rFonts w:ascii="Times New Roman" w:hAnsi="Times New Roman"/>
-          <w:b/>
-          <w:sz w:val="36"/>
-          <w:szCs w:val="52"/>
-        </w:rPr>
-        <w:t xml:space="preserve"> </w:t>
-      </w:r>
-      <w:r>
         <w:rPr>
           <w:rFonts w:ascii="Times New Roman" w:hAnsi="Times New Roman"/>
           <w:b/>
@@ -460,9 +552,14 @@
           <w:szCs w:val="52"/>
           <w:u w:val="single"/>
         </w:rPr>
-        <w:t>Date of Submission</w:t>
-      </w:r>
-      <w:r>
+      </w:pPr>
+    </w:p>
+    <w:p>
+      <w:pPr>
+        <w:autoSpaceDE w:val="0"/>
+        <w:autoSpaceDN w:val="0"/>
+        <w:adjustRightInd w:val="0"/>
+        <w:jc w:val="center"/>
         <w:rPr>
           <w:rFonts w:ascii="Times New Roman" w:hAnsi="Times New Roman"/>
           <w:b/>
@@ -470,9 +567,14 @@
           <w:szCs w:val="52"/>
           <w:u w:val="single"/>
         </w:rPr>
-        <w:t>: _</w:t>
-      </w:r>
-      <w:r>
+      </w:pPr>
+    </w:p>
+    <w:p>
+      <w:pPr>
+        <w:autoSpaceDE w:val="0"/>
+        <w:autoSpaceDN w:val="0"/>
+        <w:adjustRightInd w:val="0"/>
+        <w:jc w:val="center"/>
         <w:rPr>
           <w:rFonts w:ascii="Times New Roman" w:hAnsi="Times New Roman"/>
           <w:b/>
@@ -480,8 +582,7 @@
           <w:szCs w:val="52"/>
           <w:u w:val="single"/>
         </w:rPr>
-        <w:t>_______________</w:t>
-      </w:r>
+      </w:pPr>
     </w:p>
     <w:p>
       <w:pPr>
@@ -740,8 +841,6 @@
         </w:rPr>
         <w:t>A software company is developing an online healthcare management system that stores patient records, prescriptions, and appointment details. During the testing phase, a software engineer discovers that the system has a security vulnerability that could allow unauthorized users to access sensitive patient information. The project manager asks the engineer to ignore the issue temporarily so the product can be released on time.</w:t>
       </w:r>
-      <w:bookmarkStart w:id="0" w:name="_GoBack"/>
-      <w:bookmarkEnd w:id="0"/>
     </w:p>
     <w:p>
       <w:pPr>
@@ -754,6 +853,7 @@
     <w:p>
       <w:pPr>
         <w:pStyle w:val="Heading3"/>
+        <w:ind w:left="720"/>
         <w:rPr>
           <w:rFonts w:ascii="Times New Roman" w:hAnsi="Times New Roman"/>
         </w:rPr>
@@ -768,6 +868,7 @@
     <w:p>
       <w:pPr>
         <w:pStyle w:val="Heading3"/>
+        <w:ind w:left="720"/>
         <w:rPr>
           <w:rFonts w:ascii="Times New Roman" w:hAnsi="Times New Roman"/>
         </w:rPr>
@@ -782,6 +883,7 @@
     <w:p>
       <w:pPr>
         <w:pStyle w:val="Heading3"/>
+        <w:ind w:left="720"/>
         <w:rPr>
           <w:rFonts w:ascii="Times New Roman" w:hAnsi="Times New Roman"/>
         </w:rPr>
@@ -796,6 +898,7 @@
     <w:p>
       <w:pPr>
         <w:pStyle w:val="Heading3"/>
+        <w:ind w:left="720"/>
         <w:rPr>
           <w:rFonts w:ascii="Times New Roman" w:hAnsi="Times New Roman"/>
         </w:rPr>
@@ -805,6 +908,971 @@
           <w:rFonts w:ascii="Times New Roman" w:hAnsi="Times New Roman"/>
         </w:rPr>
         <w:t>d) Explain the possible consequences if the vulnerability is ignored.</w:t>
+      </w:r>
+    </w:p>
+    <w:p>
+      <w:pPr>
+        <w:rPr>
+          <w:rFonts w:eastAsia="Calibri"/>
+          <w:b/>
+          <w:bCs/>
+          <w:sz w:val="24"/>
+        </w:rPr>
+      </w:pPr>
+    </w:p>
+    <w:p>
+      <w:pPr>
+        <w:rPr>
+          <w:rFonts w:eastAsia="Calibri"/>
+          <w:b/>
+          <w:bCs/>
+          <w:sz w:val="24"/>
+        </w:rPr>
+      </w:pPr>
+      <w:r>
+        <w:rPr>
+          <w:rFonts w:eastAsia="Calibri"/>
+          <w:b/>
+          <w:bCs/>
+          <w:sz w:val="24"/>
+        </w:rPr>
+        <w:t>A</w:t>
+      </w:r>
+      <w:r>
+        <w:rPr>
+          <w:rFonts w:eastAsia="Calibri"/>
+          <w:b/>
+          <w:bCs/>
+          <w:sz w:val="24"/>
+        </w:rPr>
+        <w:t>) What ethical issues are involved in this situation?</w:t>
+      </w:r>
+    </w:p>
+    <w:p>
+      <w:pPr>
+        <w:rPr>
+          <w:rFonts w:eastAsia="Calibri"/>
+          <w:b/>
+          <w:bCs/>
+          <w:sz w:val="24"/>
+        </w:rPr>
+      </w:pPr>
+    </w:p>
+    <w:p>
+      <w:pPr>
+        <w:pStyle w:val="ListParagraph"/>
+        <w:rPr>
+          <w:sz w:val="24"/>
+          <w:lang w:val="en-US"/>
+        </w:rPr>
+      </w:pPr>
+      <w:r>
+        <w:rPr>
+          <w:sz w:val="24"/>
+          <w:lang w:val="en-US"/>
+        </w:rPr>
+        <w:t>Several ethical issues are involved in this case:</w:t>
+      </w:r>
+    </w:p>
+    <w:p>
+      <w:pPr>
+        <w:pStyle w:val="ListParagraph"/>
+        <w:numPr>
+          <w:ilvl w:val="0"/>
+          <w:numId w:val="17"/>
+        </w:numPr>
+        <w:rPr>
+          <w:sz w:val="24"/>
+          <w:lang w:val="en-US"/>
+        </w:rPr>
+      </w:pPr>
+      <w:r>
+        <w:rPr>
+          <w:b/>
+          <w:bCs/>
+          <w:sz w:val="24"/>
+          <w:lang w:val="en-US"/>
+        </w:rPr>
+        <w:t>Violation of Privacy and Confidentiality</w:t>
+      </w:r>
+      <w:r>
+        <w:rPr>
+          <w:sz w:val="24"/>
+          <w:lang w:val="en-US"/>
+        </w:rPr>
+        <w:br/>
+        <w:t xml:space="preserve">The healthcare management system stores sensitive patient information such as medical records, prescriptions, and appointments. Ignoring a security vulnerability may expose private data to unauthorized users, violating patient confidentiality. </w:t>
+      </w:r>
+    </w:p>
+    <w:p>
+      <w:pPr>
+        <w:pStyle w:val="ListParagraph"/>
+        <w:numPr>
+          <w:ilvl w:val="0"/>
+          <w:numId w:val="17"/>
+        </w:numPr>
+        <w:rPr>
+          <w:sz w:val="24"/>
+          <w:lang w:val="en-US"/>
+        </w:rPr>
+      </w:pPr>
+      <w:r>
+        <w:rPr>
+          <w:b/>
+          <w:bCs/>
+          <w:sz w:val="24"/>
+          <w:lang w:val="en-US"/>
+        </w:rPr>
+        <w:t>Risk to Patient Safety and Trust</w:t>
+      </w:r>
+      <w:r>
+        <w:rPr>
+          <w:sz w:val="24"/>
+          <w:lang w:val="en-US"/>
+        </w:rPr>
+        <w:br/>
+        <w:t xml:space="preserve">If patient information is leaked or modified, it can affect medical treatment and reduce trust in the healthcare system and the software company. </w:t>
+      </w:r>
+    </w:p>
+    <w:p>
+      <w:pPr>
+        <w:pStyle w:val="ListParagraph"/>
+        <w:numPr>
+          <w:ilvl w:val="0"/>
+          <w:numId w:val="17"/>
+        </w:numPr>
+        <w:rPr>
+          <w:sz w:val="24"/>
+          <w:lang w:val="en-US"/>
+        </w:rPr>
+      </w:pPr>
+      <w:r>
+        <w:rPr>
+          <w:b/>
+          <w:bCs/>
+          <w:sz w:val="24"/>
+          <w:lang w:val="en-US"/>
+        </w:rPr>
+        <w:t>Professional Negligence</w:t>
+      </w:r>
+      <w:r>
+        <w:rPr>
+          <w:sz w:val="24"/>
+          <w:lang w:val="en-US"/>
+        </w:rPr>
+        <w:br/>
+        <w:t xml:space="preserve">Releasing software with a known security flaw is irresponsible and against professional software engineering ethics. </w:t>
+      </w:r>
+    </w:p>
+    <w:p>
+      <w:pPr>
+        <w:pStyle w:val="ListParagraph"/>
+        <w:numPr>
+          <w:ilvl w:val="0"/>
+          <w:numId w:val="17"/>
+        </w:numPr>
+        <w:rPr>
+          <w:sz w:val="24"/>
+          <w:lang w:val="en-US"/>
+        </w:rPr>
+      </w:pPr>
+      <w:r>
+        <w:rPr>
+          <w:b/>
+          <w:bCs/>
+          <w:sz w:val="24"/>
+          <w:lang w:val="en-US"/>
+        </w:rPr>
+        <w:t>Conflict Between Business Goals and Ethics</w:t>
+      </w:r>
+      <w:r>
+        <w:rPr>
+          <w:sz w:val="24"/>
+          <w:lang w:val="en-US"/>
+        </w:rPr>
+        <w:br/>
+        <w:t xml:space="preserve">The project manager wants to release the product on time, while the engineer has a responsibility to ensure the software is safe and secure. </w:t>
+      </w:r>
+    </w:p>
+    <w:p>
+      <w:pPr>
+        <w:pStyle w:val="ListParagraph"/>
+        <w:numPr>
+          <w:ilvl w:val="0"/>
+          <w:numId w:val="17"/>
+        </w:numPr>
+        <w:rPr>
+          <w:sz w:val="24"/>
+          <w:lang w:val="en-US"/>
+        </w:rPr>
+      </w:pPr>
+      <w:r>
+        <w:rPr>
+          <w:b/>
+          <w:bCs/>
+          <w:sz w:val="24"/>
+          <w:lang w:val="en-US"/>
+        </w:rPr>
+        <w:t>Legal and Regulatory Concerns</w:t>
+      </w:r>
+      <w:r>
+        <w:rPr>
+          <w:sz w:val="24"/>
+          <w:lang w:val="en-US"/>
+        </w:rPr>
+        <w:br/>
+        <w:t xml:space="preserve">Healthcare systems must follow data protection laws and security standards. Ignoring vulnerabilities may lead to legal penalties and lawsuits. </w:t>
+      </w:r>
+    </w:p>
+    <w:p>
+      <w:pPr>
+        <w:pStyle w:val="ListParagraph"/>
+        <w:rPr>
+          <w:sz w:val="24"/>
+          <w:lang w:val="en-US"/>
+        </w:rPr>
+      </w:pPr>
+    </w:p>
+    <w:p>
+      <w:pPr>
+        <w:rPr>
+          <w:rFonts w:eastAsia="Calibri"/>
+          <w:b/>
+          <w:bCs/>
+          <w:sz w:val="24"/>
+        </w:rPr>
+      </w:pPr>
+      <w:r>
+        <w:rPr>
+          <w:b/>
+          <w:bCs/>
+          <w:sz w:val="24"/>
+        </w:rPr>
+        <w:t>B</w:t>
+      </w:r>
+      <w:r>
+        <w:rPr>
+          <w:rFonts w:eastAsia="Calibri"/>
+          <w:b/>
+          <w:bCs/>
+          <w:sz w:val="24"/>
+        </w:rPr>
+        <w:t>) Which professional responsibilities should the software engineer follow?</w:t>
+      </w:r>
+    </w:p>
+    <w:p>
+      <w:pPr>
+        <w:pStyle w:val="ListParagraph"/>
+        <w:rPr>
+          <w:sz w:val="24"/>
+          <w:lang w:val="en-US"/>
+        </w:rPr>
+      </w:pPr>
+    </w:p>
+    <w:p>
+      <w:pPr>
+        <w:pStyle w:val="ListParagraph"/>
+        <w:rPr>
+          <w:sz w:val="24"/>
+          <w:lang w:val="en-US"/>
+        </w:rPr>
+      </w:pPr>
+      <w:r>
+        <w:rPr>
+          <w:sz w:val="24"/>
+          <w:lang w:val="en-US"/>
+        </w:rPr>
+        <w:t>The software engineer should follow these professional responsibilities:</w:t>
+      </w:r>
+    </w:p>
+    <w:p>
+      <w:pPr>
+        <w:pStyle w:val="ListParagraph"/>
+        <w:numPr>
+          <w:ilvl w:val="0"/>
+          <w:numId w:val="18"/>
+        </w:numPr>
+        <w:rPr>
+          <w:sz w:val="24"/>
+          <w:lang w:val="en-US"/>
+        </w:rPr>
+      </w:pPr>
+      <w:r>
+        <w:rPr>
+          <w:b/>
+          <w:bCs/>
+          <w:sz w:val="24"/>
+          <w:lang w:val="en-US"/>
+        </w:rPr>
+        <w:t>Protect User Data</w:t>
+      </w:r>
+      <w:r>
+        <w:rPr>
+          <w:sz w:val="24"/>
+          <w:lang w:val="en-US"/>
+        </w:rPr>
+        <w:br/>
+        <w:t xml:space="preserve">Ensure that patient information remains secure and confidential. </w:t>
+      </w:r>
+    </w:p>
+    <w:p>
+      <w:pPr>
+        <w:pStyle w:val="ListParagraph"/>
+        <w:numPr>
+          <w:ilvl w:val="0"/>
+          <w:numId w:val="18"/>
+        </w:numPr>
+        <w:rPr>
+          <w:sz w:val="24"/>
+          <w:lang w:val="en-US"/>
+        </w:rPr>
+      </w:pPr>
+      <w:r>
+        <w:rPr>
+          <w:b/>
+          <w:bCs/>
+          <w:sz w:val="24"/>
+          <w:lang w:val="en-US"/>
+        </w:rPr>
+        <w:t>Act with Honesty and Integrity</w:t>
+      </w:r>
+      <w:r>
+        <w:rPr>
+          <w:sz w:val="24"/>
+          <w:lang w:val="en-US"/>
+        </w:rPr>
+        <w:br/>
+        <w:t xml:space="preserve">Report security risks truthfully instead of hiding them. </w:t>
+      </w:r>
+    </w:p>
+    <w:p>
+      <w:pPr>
+        <w:pStyle w:val="ListParagraph"/>
+        <w:numPr>
+          <w:ilvl w:val="0"/>
+          <w:numId w:val="18"/>
+        </w:numPr>
+        <w:rPr>
+          <w:sz w:val="24"/>
+          <w:lang w:val="en-US"/>
+        </w:rPr>
+      </w:pPr>
+      <w:r>
+        <w:rPr>
+          <w:b/>
+          <w:bCs/>
+          <w:sz w:val="24"/>
+          <w:lang w:val="en-US"/>
+        </w:rPr>
+        <w:t>Maintain Software Quality and Safety</w:t>
+      </w:r>
+      <w:r>
+        <w:rPr>
+          <w:sz w:val="24"/>
+          <w:lang w:val="en-US"/>
+        </w:rPr>
+        <w:br/>
+        <w:t xml:space="preserve">Deliver reliable and secure software that does not harm users. </w:t>
+      </w:r>
+    </w:p>
+    <w:p>
+      <w:pPr>
+        <w:pStyle w:val="ListParagraph"/>
+        <w:numPr>
+          <w:ilvl w:val="0"/>
+          <w:numId w:val="18"/>
+        </w:numPr>
+        <w:rPr>
+          <w:sz w:val="24"/>
+          <w:lang w:val="en-US"/>
+        </w:rPr>
+      </w:pPr>
+      <w:r>
+        <w:rPr>
+          <w:b/>
+          <w:bCs/>
+          <w:sz w:val="24"/>
+          <w:lang w:val="en-US"/>
+        </w:rPr>
+        <w:t>Follow Professional Codes of Ethics</w:t>
+      </w:r>
+      <w:r>
+        <w:rPr>
+          <w:sz w:val="24"/>
+          <w:lang w:val="en-US"/>
+        </w:rPr>
+        <w:br/>
+        <w:t xml:space="preserve">Software engineers should follow ethical standards such as those defined by ACM and IEEE, including responsibility to society and public welfare. </w:t>
+      </w:r>
+    </w:p>
+    <w:p>
+      <w:pPr>
+        <w:pStyle w:val="ListParagraph"/>
+        <w:numPr>
+          <w:ilvl w:val="0"/>
+          <w:numId w:val="18"/>
+        </w:numPr>
+        <w:rPr>
+          <w:sz w:val="24"/>
+          <w:lang w:val="en-US"/>
+        </w:rPr>
+      </w:pPr>
+      <w:r>
+        <w:rPr>
+          <w:b/>
+          <w:bCs/>
+          <w:sz w:val="24"/>
+          <w:lang w:val="en-US"/>
+        </w:rPr>
+        <w:t>Report Critical Issues</w:t>
+      </w:r>
+      <w:r>
+        <w:rPr>
+          <w:sz w:val="24"/>
+          <w:lang w:val="en-US"/>
+        </w:rPr>
+        <w:br/>
+        <w:t xml:space="preserve">Inform higher management or the security team about serious vulnerabilities before release. </w:t>
+      </w:r>
+    </w:p>
+    <w:p>
+      <w:pPr>
+        <w:pStyle w:val="ListParagraph"/>
+        <w:rPr>
+          <w:sz w:val="24"/>
+          <w:lang w:val="en-US"/>
+        </w:rPr>
+      </w:pPr>
+    </w:p>
+    <w:p>
+      <w:pPr>
+        <w:rPr>
+          <w:rFonts w:eastAsia="Calibri"/>
+          <w:b/>
+          <w:bCs/>
+          <w:sz w:val="24"/>
+        </w:rPr>
+      </w:pPr>
+      <w:r>
+        <w:rPr>
+          <w:b/>
+          <w:bCs/>
+          <w:sz w:val="24"/>
+        </w:rPr>
+        <w:t>C</w:t>
+      </w:r>
+      <w:r>
+        <w:rPr>
+          <w:rFonts w:eastAsia="Calibri"/>
+          <w:b/>
+          <w:bCs/>
+          <w:sz w:val="24"/>
+        </w:rPr>
+        <w:t>) What actions should the engineer take to handle this situation professionally?</w:t>
+      </w:r>
+    </w:p>
+    <w:p>
+      <w:pPr>
+        <w:pStyle w:val="ListParagraph"/>
+        <w:rPr>
+          <w:sz w:val="24"/>
+          <w:lang w:val="en-US"/>
+        </w:rPr>
+      </w:pPr>
+    </w:p>
+    <w:p>
+      <w:pPr>
+        <w:pStyle w:val="ListParagraph"/>
+        <w:rPr>
+          <w:sz w:val="24"/>
+          <w:lang w:val="en-US"/>
+        </w:rPr>
+      </w:pPr>
+      <w:r>
+        <w:rPr>
+          <w:sz w:val="24"/>
+          <w:lang w:val="en-US"/>
+        </w:rPr>
+        <w:t>The engineer should take the following professional actions:</w:t>
+      </w:r>
+    </w:p>
+    <w:p>
+      <w:pPr>
+        <w:pStyle w:val="ListParagraph"/>
+        <w:numPr>
+          <w:ilvl w:val="0"/>
+          <w:numId w:val="19"/>
+        </w:numPr>
+        <w:rPr>
+          <w:sz w:val="24"/>
+          <w:lang w:val="en-US"/>
+        </w:rPr>
+      </w:pPr>
+      <w:r>
+        <w:rPr>
+          <w:b/>
+          <w:bCs/>
+          <w:sz w:val="24"/>
+          <w:lang w:val="en-US"/>
+        </w:rPr>
+        <w:t>Document the Vulnerability</w:t>
+      </w:r>
+      <w:r>
+        <w:rPr>
+          <w:sz w:val="24"/>
+          <w:lang w:val="en-US"/>
+        </w:rPr>
+        <w:br/>
+        <w:t xml:space="preserve">Clearly record the details of the security issue, including risks and possible impacts. </w:t>
+      </w:r>
+    </w:p>
+    <w:p>
+      <w:pPr>
+        <w:pStyle w:val="ListParagraph"/>
+        <w:numPr>
+          <w:ilvl w:val="0"/>
+          <w:numId w:val="19"/>
+        </w:numPr>
+        <w:rPr>
+          <w:sz w:val="24"/>
+          <w:lang w:val="en-US"/>
+        </w:rPr>
+      </w:pPr>
+      <w:r>
+        <w:rPr>
+          <w:b/>
+          <w:bCs/>
+          <w:sz w:val="24"/>
+          <w:lang w:val="en-US"/>
+        </w:rPr>
+        <w:t>Communicate with the Project Manager</w:t>
+      </w:r>
+      <w:r>
+        <w:rPr>
+          <w:sz w:val="24"/>
+          <w:lang w:val="en-US"/>
+        </w:rPr>
+        <w:br/>
+        <w:t xml:space="preserve">Explain the seriousness of the vulnerability and why it should be fixed before release. </w:t>
+      </w:r>
+    </w:p>
+    <w:p>
+      <w:pPr>
+        <w:pStyle w:val="ListParagraph"/>
+        <w:numPr>
+          <w:ilvl w:val="0"/>
+          <w:numId w:val="19"/>
+        </w:numPr>
+        <w:rPr>
+          <w:sz w:val="24"/>
+          <w:lang w:val="en-US"/>
+        </w:rPr>
+      </w:pPr>
+      <w:r>
+        <w:rPr>
+          <w:b/>
+          <w:bCs/>
+          <w:sz w:val="24"/>
+          <w:lang w:val="en-US"/>
+        </w:rPr>
+        <w:t>Recommend Solutions</w:t>
+      </w:r>
+      <w:r>
+        <w:rPr>
+          <w:sz w:val="24"/>
+          <w:lang w:val="en-US"/>
+        </w:rPr>
+        <w:br/>
+        <w:t xml:space="preserve">Suggest immediate fixes, temporary safeguards, or delaying the release until the issue is resolved. </w:t>
+      </w:r>
+    </w:p>
+    <w:p>
+      <w:pPr>
+        <w:pStyle w:val="ListParagraph"/>
+        <w:numPr>
+          <w:ilvl w:val="0"/>
+          <w:numId w:val="19"/>
+        </w:numPr>
+        <w:rPr>
+          <w:sz w:val="24"/>
+          <w:lang w:val="en-US"/>
+        </w:rPr>
+      </w:pPr>
+      <w:r>
+        <w:rPr>
+          <w:b/>
+          <w:bCs/>
+          <w:sz w:val="24"/>
+          <w:lang w:val="en-US"/>
+        </w:rPr>
+        <w:t>Escalate the Issue if Necessary</w:t>
+      </w:r>
+      <w:r>
+        <w:rPr>
+          <w:sz w:val="24"/>
+          <w:lang w:val="en-US"/>
+        </w:rPr>
+        <w:br/>
+        <w:t xml:space="preserve">If the manager ignores the problem, the engineer should report it to senior management, the security department, or compliance officers. </w:t>
+      </w:r>
+    </w:p>
+    <w:p>
+      <w:pPr>
+        <w:pStyle w:val="ListParagraph"/>
+        <w:numPr>
+          <w:ilvl w:val="0"/>
+          <w:numId w:val="19"/>
+        </w:numPr>
+        <w:rPr>
+          <w:sz w:val="24"/>
+          <w:lang w:val="en-US"/>
+        </w:rPr>
+      </w:pPr>
+      <w:r>
+        <w:rPr>
+          <w:b/>
+          <w:bCs/>
+          <w:sz w:val="24"/>
+          <w:lang w:val="en-US"/>
+        </w:rPr>
+        <w:t>Follow Company Policies and Ethical Standards</w:t>
+      </w:r>
+      <w:r>
+        <w:rPr>
+          <w:sz w:val="24"/>
+          <w:lang w:val="en-US"/>
+        </w:rPr>
+        <w:br/>
+        <w:t xml:space="preserve">Ensure all actions are professional, documented, and aligned with organizational and ethical guidelines. </w:t>
+      </w:r>
+    </w:p>
+    <w:p>
+      <w:pPr>
+        <w:pStyle w:val="ListParagraph"/>
+        <w:rPr>
+          <w:sz w:val="24"/>
+          <w:lang w:val="en-US"/>
+        </w:rPr>
+      </w:pPr>
+    </w:p>
+    <w:p>
+      <w:pPr>
+        <w:rPr>
+          <w:rFonts w:eastAsia="Calibri"/>
+          <w:b/>
+          <w:bCs/>
+          <w:sz w:val="24"/>
+        </w:rPr>
+      </w:pPr>
+      <w:r>
+        <w:rPr>
+          <w:b/>
+          <w:bCs/>
+          <w:sz w:val="24"/>
+        </w:rPr>
+        <w:t>D</w:t>
+      </w:r>
+      <w:r>
+        <w:rPr>
+          <w:rFonts w:eastAsia="Calibri"/>
+          <w:b/>
+          <w:bCs/>
+          <w:sz w:val="24"/>
+        </w:rPr>
+        <w:t>) Explain the possible consequences if the vulnerability is ignored.</w:t>
+      </w:r>
+    </w:p>
+    <w:p>
+      <w:pPr>
+        <w:pStyle w:val="ListParagraph"/>
+        <w:rPr>
+          <w:sz w:val="24"/>
+          <w:lang w:val="en-US"/>
+        </w:rPr>
+      </w:pPr>
+    </w:p>
+    <w:p>
+      <w:pPr>
+        <w:pStyle w:val="ListParagraph"/>
+        <w:rPr>
+          <w:sz w:val="24"/>
+          <w:lang w:val="en-US"/>
+        </w:rPr>
+      </w:pPr>
+      <w:r>
+        <w:rPr>
+          <w:sz w:val="24"/>
+          <w:lang w:val="en-US"/>
+        </w:rPr>
+        <w:lastRenderedPageBreak/>
+        <w:t>Ignoring the vulnerability can lead to serious consequences:</w:t>
+      </w:r>
+    </w:p>
+    <w:p>
+      <w:pPr>
+        <w:pStyle w:val="ListParagraph"/>
+        <w:numPr>
+          <w:ilvl w:val="0"/>
+          <w:numId w:val="20"/>
+        </w:numPr>
+        <w:rPr>
+          <w:sz w:val="24"/>
+          <w:lang w:val="en-US"/>
+        </w:rPr>
+      </w:pPr>
+      <w:r>
+        <w:rPr>
+          <w:b/>
+          <w:bCs/>
+          <w:sz w:val="24"/>
+          <w:lang w:val="en-US"/>
+        </w:rPr>
+        <w:t>Data Breaches</w:t>
+      </w:r>
+      <w:r>
+        <w:rPr>
+          <w:sz w:val="24"/>
+          <w:lang w:val="en-US"/>
+        </w:rPr>
+        <w:br/>
+        <w:t xml:space="preserve">Unauthorized users may access or steal sensitive patient information. </w:t>
+      </w:r>
+    </w:p>
+    <w:p>
+      <w:pPr>
+        <w:pStyle w:val="ListParagraph"/>
+        <w:numPr>
+          <w:ilvl w:val="0"/>
+          <w:numId w:val="20"/>
+        </w:numPr>
+        <w:rPr>
+          <w:sz w:val="24"/>
+          <w:lang w:val="en-US"/>
+        </w:rPr>
+      </w:pPr>
+      <w:r>
+        <w:rPr>
+          <w:b/>
+          <w:bCs/>
+          <w:sz w:val="24"/>
+          <w:lang w:val="en-US"/>
+        </w:rPr>
+        <w:t>Loss of Patient Trust</w:t>
+      </w:r>
+      <w:r>
+        <w:rPr>
+          <w:sz w:val="24"/>
+          <w:lang w:val="en-US"/>
+        </w:rPr>
+        <w:br/>
+        <w:t xml:space="preserve">Patients may lose confidence in the healthcare system and stop using the service. </w:t>
+      </w:r>
+    </w:p>
+    <w:p>
+      <w:pPr>
+        <w:pStyle w:val="ListParagraph"/>
+        <w:numPr>
+          <w:ilvl w:val="0"/>
+          <w:numId w:val="20"/>
+        </w:numPr>
+        <w:rPr>
+          <w:sz w:val="24"/>
+          <w:lang w:val="en-US"/>
+        </w:rPr>
+      </w:pPr>
+      <w:r>
+        <w:rPr>
+          <w:b/>
+          <w:bCs/>
+          <w:sz w:val="24"/>
+          <w:lang w:val="en-US"/>
+        </w:rPr>
+        <w:t>Financial Losses</w:t>
+      </w:r>
+      <w:r>
+        <w:rPr>
+          <w:sz w:val="24"/>
+          <w:lang w:val="en-US"/>
+        </w:rPr>
+        <w:br/>
+        <w:t xml:space="preserve">The company may face lawsuits, compensation claims, fines, and recovery costs. </w:t>
+      </w:r>
+    </w:p>
+    <w:p>
+      <w:pPr>
+        <w:pStyle w:val="ListParagraph"/>
+        <w:numPr>
+          <w:ilvl w:val="0"/>
+          <w:numId w:val="20"/>
+        </w:numPr>
+        <w:rPr>
+          <w:sz w:val="24"/>
+          <w:lang w:val="en-US"/>
+        </w:rPr>
+      </w:pPr>
+      <w:r>
+        <w:rPr>
+          <w:b/>
+          <w:bCs/>
+          <w:sz w:val="24"/>
+          <w:lang w:val="en-US"/>
+        </w:rPr>
+        <w:t>Legal Penalties</w:t>
+      </w:r>
+      <w:r>
+        <w:rPr>
+          <w:sz w:val="24"/>
+          <w:lang w:val="en-US"/>
+        </w:rPr>
+        <w:br/>
+        <w:t xml:space="preserve">Violating healthcare data protection regulations can result in legal action against the company. </w:t>
+      </w:r>
+    </w:p>
+    <w:p>
+      <w:pPr>
+        <w:pStyle w:val="ListParagraph"/>
+        <w:numPr>
+          <w:ilvl w:val="0"/>
+          <w:numId w:val="20"/>
+        </w:numPr>
+        <w:rPr>
+          <w:sz w:val="24"/>
+          <w:lang w:val="en-US"/>
+        </w:rPr>
+      </w:pPr>
+      <w:r>
+        <w:rPr>
+          <w:b/>
+          <w:bCs/>
+          <w:sz w:val="24"/>
+          <w:lang w:val="en-US"/>
+        </w:rPr>
+        <w:t>Damage to Company Reputation</w:t>
+      </w:r>
+      <w:r>
+        <w:rPr>
+          <w:sz w:val="24"/>
+          <w:lang w:val="en-US"/>
+        </w:rPr>
+        <w:br/>
+        <w:t xml:space="preserve">Public disclosure of a security breach can severely harm the company’s image and future business opportunities. </w:t>
+      </w:r>
+    </w:p>
+    <w:p>
+      <w:pPr>
+        <w:pStyle w:val="ListParagraph"/>
+        <w:numPr>
+          <w:ilvl w:val="0"/>
+          <w:numId w:val="20"/>
+        </w:numPr>
+        <w:rPr>
+          <w:sz w:val="24"/>
+          <w:lang w:val="en-US"/>
+        </w:rPr>
+      </w:pPr>
+      <w:r>
+        <w:rPr>
+          <w:b/>
+          <w:bCs/>
+          <w:sz w:val="24"/>
+          <w:lang w:val="en-US"/>
+        </w:rPr>
+        <w:t>Risk to Patient Health</w:t>
+      </w:r>
+      <w:r>
+        <w:rPr>
+          <w:sz w:val="24"/>
+          <w:lang w:val="en-US"/>
+        </w:rPr>
+        <w:br/>
+        <w:t xml:space="preserve">Altered or leaked medical records may lead to incorrect treatments or medical decisions. </w:t>
+      </w:r>
+    </w:p>
+    <w:p>
+      <w:pPr>
+        <w:pStyle w:val="ListParagraph"/>
+        <w:numPr>
+          <w:ilvl w:val="0"/>
+          <w:numId w:val="20"/>
+        </w:numPr>
+        <w:rPr>
+          <w:sz w:val="24"/>
+          <w:lang w:val="en-US"/>
+        </w:rPr>
+      </w:pPr>
+      <w:r>
+        <w:rPr>
+          <w:b/>
+          <w:bCs/>
+          <w:sz w:val="24"/>
+          <w:lang w:val="en-US"/>
+        </w:rPr>
+        <w:t>Career and Professional Consequences</w:t>
+      </w:r>
+      <w:r>
+        <w:rPr>
+          <w:sz w:val="24"/>
+          <w:lang w:val="en-US"/>
+        </w:rPr>
+        <w:br/>
+        <w:t xml:space="preserve">Engineers and managers involved may face disciplinary action, loss of professional credibility, or termination. </w:t>
+      </w:r>
+    </w:p>
+    <w:p>
+      <w:pPr>
+        <w:ind w:left="360"/>
+        <w:jc w:val="both"/>
+        <w:rPr>
+          <w:rFonts w:eastAsia="Calibri"/>
+          <w:sz w:val="24"/>
+        </w:rPr>
+      </w:pPr>
+    </w:p>
+    <w:p>
+      <w:pPr>
+        <w:ind w:left="360"/>
+        <w:jc w:val="both"/>
+        <w:rPr>
+          <w:rFonts w:eastAsia="Calibri"/>
+          <w:sz w:val="24"/>
+        </w:rPr>
+      </w:pPr>
+    </w:p>
+    <w:p>
+      <w:pPr>
+        <w:jc w:val="both"/>
+        <w:rPr>
+          <w:rFonts w:eastAsia="Calibri"/>
+          <w:b/>
+          <w:bCs/>
+          <w:sz w:val="24"/>
+        </w:rPr>
+      </w:pPr>
+      <w:r>
+        <w:rPr>
+          <w:rFonts w:eastAsia="Calibri"/>
+          <w:b/>
+          <w:bCs/>
+          <w:sz w:val="24"/>
+        </w:rPr>
+        <w:t>Conclusion</w:t>
+      </w:r>
+    </w:p>
+    <w:p>
+      <w:pPr>
+        <w:pStyle w:val="ListParagraph"/>
+        <w:jc w:val="both"/>
+        <w:rPr>
+          <w:sz w:val="24"/>
+          <w:lang w:val="en-US"/>
+        </w:rPr>
+      </w:pPr>
+      <w:r>
+        <w:rPr>
+          <w:sz w:val="24"/>
+          <w:lang w:val="en-US"/>
+        </w:rPr>
+        <w:t>The software engineer has an ethical and professional responsibility to prioritize patient safety, privacy, and software security over project deadlines. Ignoring known vulnerabilities can lead to severe legal, financial, and social consequences. Therefore, the issue should be properly reported and resolved before the system is released.</w:t>
       </w:r>
     </w:p>
     <w:p>
@@ -836,7 +1904,7 @@
 </file>
 
 <file path=word/endnotes.xml><?xml version="1.0" encoding="utf-8"?>
-<w:endnotes xmlns:wpc="http://schemas.microsoft.com/office/word/2010/wordprocessingCanvas" xmlns:cx="http://schemas.microsoft.com/office/drawing/2014/chartex" xmlns:mc="http://schemas.openxmlformats.org/markup-compatibility/2006" xmlns:o="urn:schemas-microsoft-com:office:office" xmlns:r="http://schemas.openxmlformats.org/officeDocument/2006/relationships" xmlns:m="http://schemas.openxmlformats.org/officeDocument/2006/math" xmlns:v="urn:schemas-microsoft-com:vml" xmlns:wp14="http://schemas.microsoft.com/office/word/2010/wordprocessingDrawing" xmlns:wp="http://schemas.openxmlformats.org/drawingml/2006/wordprocessingDrawing" xmlns:w10="urn:schemas-microsoft-com:office:word" xmlns:w="http://schemas.openxmlformats.org/wordprocessingml/2006/main" xmlns:w14="http://schemas.microsoft.com/office/word/2010/wordml" xmlns:w15="http://schemas.microsoft.com/office/word/2012/wordml" xmlns:w16se="http://schemas.microsoft.com/office/word/2015/wordml/symex" xmlns:wpg="http://schemas.microsoft.com/office/word/2010/wordprocessingGroup" xmlns:wpi="http://schemas.microsoft.com/office/word/2010/wordprocessingInk" xmlns:wne="http://schemas.microsoft.com/office/word/2006/wordml" xmlns:wps="http://schemas.microsoft.com/office/word/2010/wordprocessingShape" mc:Ignorable="w14 w15 w16se wp14">
+<w:endnotes xmlns:wpc="http://schemas.microsoft.com/office/word/2010/wordprocessingCanvas" xmlns:cx="http://schemas.microsoft.com/office/drawing/2014/chartex" xmlns:cx1="http://schemas.microsoft.com/office/drawing/2015/9/8/chartex" xmlns:cx2="http://schemas.microsoft.com/office/drawing/2015/10/21/chartex" xmlns:cx3="http://schemas.microsoft.com/office/drawing/2016/5/9/chartex" xmlns:cx4="http://schemas.microsoft.com/office/drawing/2016/5/10/chartex" xmlns:cx5="http://schemas.microsoft.com/office/drawing/2016/5/11/chartex" xmlns:cx6="http://schemas.microsoft.com/office/drawing/2016/5/12/chartex" xmlns:cx7="http://schemas.microsoft.com/office/drawing/2016/5/13/chartex" xmlns:cx8="http://schemas.microsoft.com/office/drawing/2016/5/14/chartex" xmlns:mc="http://schemas.openxmlformats.org/markup-compatibility/2006" xmlns:aink="http://schemas.microsoft.com/office/drawing/2016/ink" xmlns:am3d="http://schemas.microsoft.com/office/drawing/2017/model3d" xmlns:o="urn:schemas-microsoft-com:office:office" xmlns:oel="http://schemas.microsoft.com/office/2019/extlst" xmlns:r="http://schemas.openxmlformats.org/officeDocument/2006/relationships" xmlns:m="http://schemas.openxmlformats.org/officeDocument/2006/math" xmlns:v="urn:schemas-microsoft-com:vml" xmlns:wp14="http://schemas.microsoft.com/office/word/2010/wordprocessingDrawing" xmlns:wp="http://schemas.openxmlformats.org/drawingml/2006/wordprocessingDrawing" xmlns:w10="urn:schemas-microsoft-com:office:word" xmlns:w="http://schemas.openxmlformats.org/wordprocessingml/2006/main" xmlns:w14="http://schemas.microsoft.com/office/word/2010/wordml" xmlns:w15="http://schemas.microsoft.com/office/word/2012/wordml" xmlns:w16cex="http://schemas.microsoft.com/office/word/2018/wordml/cex" xmlns:w16cid="http://schemas.microsoft.com/office/word/2016/wordml/cid" xmlns:w16="http://schemas.microsoft.com/office/word/2018/wordml" xmlns:w16du="http://schemas.microsoft.com/office/word/2023/wordml/word16du" xmlns:w16sdtdh="http://schemas.microsoft.com/office/word/2020/wordml/sdtdatahash" xmlns:w16sdtfl="http://schemas.microsoft.com/office/word/2024/wordml/sdtformatlock" xmlns:w16se="http://schemas.microsoft.com/office/word/2015/wordml/symex" xmlns:wpg="http://schemas.microsoft.com/office/word/2010/wordprocessingGroup" xmlns:wpi="http://schemas.microsoft.com/office/word/2010/wordprocessingInk" xmlns:wne="http://schemas.microsoft.com/office/word/2006/wordml" xmlns:wps="http://schemas.microsoft.com/office/word/2010/wordprocessingShape" mc:Ignorable="w14 w15 w16se w16cid w16 w16cex w16sdtdh w16sdtfl w16du wp14">
   <w:endnote w:type="separator" w:id="-1">
     <w:p>
       <w:r>
@@ -855,7 +1923,7 @@
 </file>
 
 <file path=word/footer1.xml><?xml version="1.0" encoding="utf-8"?>
-<w:ftr xmlns:wpc="http://schemas.microsoft.com/office/word/2010/wordprocessingCanvas" xmlns:cx="http://schemas.microsoft.com/office/drawing/2014/chartex" xmlns:mc="http://schemas.openxmlformats.org/markup-compatibility/2006" xmlns:o="urn:schemas-microsoft-com:office:office" xmlns:r="http://schemas.openxmlformats.org/officeDocument/2006/relationships" xmlns:m="http://schemas.openxmlformats.org/officeDocument/2006/math" xmlns:v="urn:schemas-microsoft-com:vml" xmlns:wp14="http://schemas.microsoft.com/office/word/2010/wordprocessingDrawing" xmlns:wp="http://schemas.openxmlformats.org/drawingml/2006/wordprocessingDrawing" xmlns:w10="urn:schemas-microsoft-com:office:word" xmlns:w="http://schemas.openxmlformats.org/wordprocessingml/2006/main" xmlns:w14="http://schemas.microsoft.com/office/word/2010/wordml" xmlns:w15="http://schemas.microsoft.com/office/word/2012/wordml" xmlns:w16se="http://schemas.microsoft.com/office/word/2015/wordml/symex" xmlns:wpg="http://schemas.microsoft.com/office/word/2010/wordprocessingGroup" xmlns:wpi="http://schemas.microsoft.com/office/word/2010/wordprocessingInk" xmlns:wne="http://schemas.microsoft.com/office/word/2006/wordml" xmlns:wps="http://schemas.microsoft.com/office/word/2010/wordprocessingShape" mc:Ignorable="w14 w15 w16se wp14">
+<w:ftr xmlns:wpc="http://schemas.microsoft.com/office/word/2010/wordprocessingCanvas" xmlns:cx="http://schemas.microsoft.com/office/drawing/2014/chartex" xmlns:cx1="http://schemas.microsoft.com/office/drawing/2015/9/8/chartex" xmlns:cx2="http://schemas.microsoft.com/office/drawing/2015/10/21/chartex" xmlns:cx3="http://schemas.microsoft.com/office/drawing/2016/5/9/chartex" xmlns:cx4="http://schemas.microsoft.com/office/drawing/2016/5/10/chartex" xmlns:cx5="http://schemas.microsoft.com/office/drawing/2016/5/11/chartex" xmlns:cx6="http://schemas.microsoft.com/office/drawing/2016/5/12/chartex" xmlns:cx7="http://schemas.microsoft.com/office/drawing/2016/5/13/chartex" xmlns:cx8="http://schemas.microsoft.com/office/drawing/2016/5/14/chartex" xmlns:mc="http://schemas.openxmlformats.org/markup-compatibility/2006" xmlns:aink="http://schemas.microsoft.com/office/drawing/2016/ink" xmlns:am3d="http://schemas.microsoft.com/office/drawing/2017/model3d" xmlns:o="urn:schemas-microsoft-com:office:office" xmlns:oel="http://schemas.microsoft.com/office/2019/extlst" xmlns:r="http://schemas.openxmlformats.org/officeDocument/2006/relationships" xmlns:m="http://schemas.openxmlformats.org/officeDocument/2006/math" xmlns:v="urn:schemas-microsoft-com:vml" xmlns:wp14="http://schemas.microsoft.com/office/word/2010/wordprocessingDrawing" xmlns:wp="http://schemas.openxmlformats.org/drawingml/2006/wordprocessingDrawing" xmlns:w10="urn:schemas-microsoft-com:office:word" xmlns:w="http://schemas.openxmlformats.org/wordprocessingml/2006/main" xmlns:w14="http://schemas.microsoft.com/office/word/2010/wordml" xmlns:w15="http://schemas.microsoft.com/office/word/2012/wordml" xmlns:w16cex="http://schemas.microsoft.com/office/word/2018/wordml/cex" xmlns:w16cid="http://schemas.microsoft.com/office/word/2016/wordml/cid" xmlns:w16="http://schemas.microsoft.com/office/word/2018/wordml" xmlns:w16du="http://schemas.microsoft.com/office/word/2023/wordml/word16du" xmlns:w16sdtdh="http://schemas.microsoft.com/office/word/2020/wordml/sdtdatahash" xmlns:w16sdtfl="http://schemas.microsoft.com/office/word/2024/wordml/sdtformatlock" xmlns:w16se="http://schemas.microsoft.com/office/word/2015/wordml/symex" xmlns:wpg="http://schemas.microsoft.com/office/word/2010/wordprocessingGroup" xmlns:wpi="http://schemas.microsoft.com/office/word/2010/wordprocessingInk" xmlns:wne="http://schemas.microsoft.com/office/word/2006/wordml" xmlns:wps="http://schemas.microsoft.com/office/word/2010/wordprocessingShape" mc:Ignorable="w14 w15 w16se w16cid w16 w16cex w16sdtdh w16sdtfl w16du wp14">
   <w:p>
     <w:pPr>
       <w:pStyle w:val="Footer"/>
@@ -936,7 +2004,7 @@
 </file>
 
 <file path=word/footnotes.xml><?xml version="1.0" encoding="utf-8"?>
-<w:footnotes xmlns:wpc="http://schemas.microsoft.com/office/word/2010/wordprocessingCanvas" xmlns:cx="http://schemas.microsoft.com/office/drawing/2014/chartex" xmlns:mc="http://schemas.openxmlformats.org/markup-compatibility/2006" xmlns:o="urn:schemas-microsoft-com:office:office" xmlns:r="http://schemas.openxmlformats.org/officeDocument/2006/relationships" xmlns:m="http://schemas.openxmlformats.org/officeDocument/2006/math" xmlns:v="urn:schemas-microsoft-com:vml" xmlns:wp14="http://schemas.microsoft.com/office/word/2010/wordprocessingDrawing" xmlns:wp="http://schemas.openxmlformats.org/drawingml/2006/wordprocessingDrawing" xmlns:w10="urn:schemas-microsoft-com:office:word" xmlns:w="http://schemas.openxmlformats.org/wordprocessingml/2006/main" xmlns:w14="http://schemas.microsoft.com/office/word/2010/wordml" xmlns:w15="http://schemas.microsoft.com/office/word/2012/wordml" xmlns:w16se="http://schemas.microsoft.com/office/word/2015/wordml/symex" xmlns:wpg="http://schemas.microsoft.com/office/word/2010/wordprocessingGroup" xmlns:wpi="http://schemas.microsoft.com/office/word/2010/wordprocessingInk" xmlns:wne="http://schemas.microsoft.com/office/word/2006/wordml" xmlns:wps="http://schemas.microsoft.com/office/word/2010/wordprocessingShape" mc:Ignorable="w14 w15 w16se wp14">
+<w:footnotes xmlns:wpc="http://schemas.microsoft.com/office/word/2010/wordprocessingCanvas" xmlns:cx="http://schemas.microsoft.com/office/drawing/2014/chartex" xmlns:cx1="http://schemas.microsoft.com/office/drawing/2015/9/8/chartex" xmlns:cx2="http://schemas.microsoft.com/office/drawing/2015/10/21/chartex" xmlns:cx3="http://schemas.microsoft.com/office/drawing/2016/5/9/chartex" xmlns:cx4="http://schemas.microsoft.com/office/drawing/2016/5/10/chartex" xmlns:cx5="http://schemas.microsoft.com/office/drawing/2016/5/11/chartex" xmlns:cx6="http://schemas.microsoft.com/office/drawing/2016/5/12/chartex" xmlns:cx7="http://schemas.microsoft.com/office/drawing/2016/5/13/chartex" xmlns:cx8="http://schemas.microsoft.com/office/drawing/2016/5/14/chartex" xmlns:mc="http://schemas.openxmlformats.org/markup-compatibility/2006" xmlns:aink="http://schemas.microsoft.com/office/drawing/2016/ink" xmlns:am3d="http://schemas.microsoft.com/office/drawing/2017/model3d" xmlns:o="urn:schemas-microsoft-com:office:office" xmlns:oel="http://schemas.microsoft.com/office/2019/extlst" xmlns:r="http://schemas.openxmlformats.org/officeDocument/2006/relationships" xmlns:m="http://schemas.openxmlformats.org/officeDocument/2006/math" xmlns:v="urn:schemas-microsoft-com:vml" xmlns:wp14="http://schemas.microsoft.com/office/word/2010/wordprocessingDrawing" xmlns:wp="http://schemas.openxmlformats.org/drawingml/2006/wordprocessingDrawing" xmlns:w10="urn:schemas-microsoft-com:office:word" xmlns:w="http://schemas.openxmlformats.org/wordprocessingml/2006/main" xmlns:w14="http://schemas.microsoft.com/office/word/2010/wordml" xmlns:w15="http://schemas.microsoft.com/office/word/2012/wordml" xmlns:w16cex="http://schemas.microsoft.com/office/word/2018/wordml/cex" xmlns:w16cid="http://schemas.microsoft.com/office/word/2016/wordml/cid" xmlns:w16="http://schemas.microsoft.com/office/word/2018/wordml" xmlns:w16du="http://schemas.microsoft.com/office/word/2023/wordml/word16du" xmlns:w16sdtdh="http://schemas.microsoft.com/office/word/2020/wordml/sdtdatahash" xmlns:w16sdtfl="http://schemas.microsoft.com/office/word/2024/wordml/sdtformatlock" xmlns:w16se="http://schemas.microsoft.com/office/word/2015/wordml/symex" xmlns:wpg="http://schemas.microsoft.com/office/word/2010/wordprocessingGroup" xmlns:wpi="http://schemas.microsoft.com/office/word/2010/wordprocessingInk" xmlns:wne="http://schemas.microsoft.com/office/word/2006/wordml" xmlns:wps="http://schemas.microsoft.com/office/word/2010/wordprocessingShape" mc:Ignorable="w14 w15 w16se w16cid w16 w16cex w16sdtdh w16sdtfl w16du wp14">
   <w:footnote w:type="separator" w:id="-1">
     <w:p>
       <w:r>
@@ -955,7 +2023,7 @@
 </file>
 
 <file path=word/header1.xml><?xml version="1.0" encoding="utf-8"?>
-<w:hdr xmlns:wpc="http://schemas.microsoft.com/office/word/2010/wordprocessingCanvas" xmlns:cx="http://schemas.microsoft.com/office/drawing/2014/chartex" xmlns:mc="http://schemas.openxmlformats.org/markup-compatibility/2006" xmlns:o="urn:schemas-microsoft-com:office:office" xmlns:r="http://schemas.openxmlformats.org/officeDocument/2006/relationships" xmlns:m="http://schemas.openxmlformats.org/officeDocument/2006/math" xmlns:v="urn:schemas-microsoft-com:vml" xmlns:wp14="http://schemas.microsoft.com/office/word/2010/wordprocessingDrawing" xmlns:wp="http://schemas.openxmlformats.org/drawingml/2006/wordprocessingDrawing" xmlns:w10="urn:schemas-microsoft-com:office:word" xmlns:w="http://schemas.openxmlformats.org/wordprocessingml/2006/main" xmlns:w14="http://schemas.microsoft.com/office/word/2010/wordml" xmlns:w15="http://schemas.microsoft.com/office/word/2012/wordml" xmlns:w16se="http://schemas.microsoft.com/office/word/2015/wordml/symex" xmlns:wpg="http://schemas.microsoft.com/office/word/2010/wordprocessingGroup" xmlns:wpi="http://schemas.microsoft.com/office/word/2010/wordprocessingInk" xmlns:wne="http://schemas.microsoft.com/office/word/2006/wordml" xmlns:wps="http://schemas.microsoft.com/office/word/2010/wordprocessingShape" mc:Ignorable="w14 w15 w16se wp14">
+<w:hdr xmlns:wpc="http://schemas.microsoft.com/office/word/2010/wordprocessingCanvas" xmlns:cx="http://schemas.microsoft.com/office/drawing/2014/chartex" xmlns:cx1="http://schemas.microsoft.com/office/drawing/2015/9/8/chartex" xmlns:cx2="http://schemas.microsoft.com/office/drawing/2015/10/21/chartex" xmlns:cx3="http://schemas.microsoft.com/office/drawing/2016/5/9/chartex" xmlns:cx4="http://schemas.microsoft.com/office/drawing/2016/5/10/chartex" xmlns:cx5="http://schemas.microsoft.com/office/drawing/2016/5/11/chartex" xmlns:cx6="http://schemas.microsoft.com/office/drawing/2016/5/12/chartex" xmlns:cx7="http://schemas.microsoft.com/office/drawing/2016/5/13/chartex" xmlns:cx8="http://schemas.microsoft.com/office/drawing/2016/5/14/chartex" xmlns:mc="http://schemas.openxmlformats.org/markup-compatibility/2006" xmlns:aink="http://schemas.microsoft.com/office/drawing/2016/ink" xmlns:am3d="http://schemas.microsoft.com/office/drawing/2017/model3d" xmlns:o="urn:schemas-microsoft-com:office:office" xmlns:oel="http://schemas.microsoft.com/office/2019/extlst" xmlns:r="http://schemas.openxmlformats.org/officeDocument/2006/relationships" xmlns:m="http://schemas.openxmlformats.org/officeDocument/2006/math" xmlns:v="urn:schemas-microsoft-com:vml" xmlns:wp14="http://schemas.microsoft.com/office/word/2010/wordprocessingDrawing" xmlns:wp="http://schemas.openxmlformats.org/drawingml/2006/wordprocessingDrawing" xmlns:w10="urn:schemas-microsoft-com:office:word" xmlns:w="http://schemas.openxmlformats.org/wordprocessingml/2006/main" xmlns:w14="http://schemas.microsoft.com/office/word/2010/wordml" xmlns:w15="http://schemas.microsoft.com/office/word/2012/wordml" xmlns:w16cex="http://schemas.microsoft.com/office/word/2018/wordml/cex" xmlns:w16cid="http://schemas.microsoft.com/office/word/2016/wordml/cid" xmlns:w16="http://schemas.microsoft.com/office/word/2018/wordml" xmlns:w16du="http://schemas.microsoft.com/office/word/2023/wordml/word16du" xmlns:w16sdtdh="http://schemas.microsoft.com/office/word/2020/wordml/sdtdatahash" xmlns:w16sdtfl="http://schemas.microsoft.com/office/word/2024/wordml/sdtformatlock" xmlns:w16se="http://schemas.microsoft.com/office/word/2015/wordml/symex" xmlns:wpg="http://schemas.microsoft.com/office/word/2010/wordprocessingGroup" xmlns:wpi="http://schemas.microsoft.com/office/word/2010/wordprocessingInk" xmlns:wne="http://schemas.microsoft.com/office/word/2006/wordml" xmlns:wps="http://schemas.microsoft.com/office/word/2010/wordprocessingShape" mc:Ignorable="w14 w15 w16se w16cid w16 w16cex w16sdtdh w16sdtfl w16du wp14">
   <w:p>
     <w:pPr>
       <w:pStyle w:val="Heading3"/>
@@ -1109,8 +2177,121 @@
 </file>
 
 <file path=word/numbering.xml><?xml version="1.0" encoding="utf-8"?>
-<w:numbering xmlns:wpc="http://schemas.microsoft.com/office/word/2010/wordprocessingCanvas" xmlns:cx="http://schemas.microsoft.com/office/drawing/2014/chartex" xmlns:mc="http://schemas.openxmlformats.org/markup-compatibility/2006" xmlns:o="urn:schemas-microsoft-com:office:office" xmlns:r="http://schemas.openxmlformats.org/officeDocument/2006/relationships" xmlns:m="http://schemas.openxmlformats.org/officeDocument/2006/math" xmlns:v="urn:schemas-microsoft-com:vml" xmlns:wp14="http://schemas.microsoft.com/office/word/2010/wordprocessingDrawing" xmlns:wp="http://schemas.openxmlformats.org/drawingml/2006/wordprocessingDrawing" xmlns:w10="urn:schemas-microsoft-com:office:word" xmlns:w="http://schemas.openxmlformats.org/wordprocessingml/2006/main" xmlns:w14="http://schemas.microsoft.com/office/word/2010/wordml" xmlns:w15="http://schemas.microsoft.com/office/word/2012/wordml" xmlns:w16se="http://schemas.microsoft.com/office/word/2015/wordml/symex" xmlns:wpg="http://schemas.microsoft.com/office/word/2010/wordprocessingGroup" xmlns:wpi="http://schemas.microsoft.com/office/word/2010/wordprocessingInk" xmlns:wne="http://schemas.microsoft.com/office/word/2006/wordml" xmlns:wps="http://schemas.microsoft.com/office/word/2010/wordprocessingShape" mc:Ignorable="w14 w15 w16se wp14">
+<w:numbering xmlns:wpc="http://schemas.microsoft.com/office/word/2010/wordprocessingCanvas" xmlns:cx="http://schemas.microsoft.com/office/drawing/2014/chartex" xmlns:cx1="http://schemas.microsoft.com/office/drawing/2015/9/8/chartex" xmlns:cx2="http://schemas.microsoft.com/office/drawing/2015/10/21/chartex" xmlns:cx3="http://schemas.microsoft.com/office/drawing/2016/5/9/chartex" xmlns:cx4="http://schemas.microsoft.com/office/drawing/2016/5/10/chartex" xmlns:cx5="http://schemas.microsoft.com/office/drawing/2016/5/11/chartex" xmlns:cx6="http://schemas.microsoft.com/office/drawing/2016/5/12/chartex" xmlns:cx7="http://schemas.microsoft.com/office/drawing/2016/5/13/chartex" xmlns:cx8="http://schemas.microsoft.com/office/drawing/2016/5/14/chartex" xmlns:mc="http://schemas.openxmlformats.org/markup-compatibility/2006" xmlns:aink="http://schemas.microsoft.com/office/drawing/2016/ink" xmlns:am3d="http://schemas.microsoft.com/office/drawing/2017/model3d" xmlns:o="urn:schemas-microsoft-com:office:office" xmlns:oel="http://schemas.microsoft.com/office/2019/extlst" xmlns:r="http://schemas.openxmlformats.org/officeDocument/2006/relationships" xmlns:m="http://schemas.openxmlformats.org/officeDocument/2006/math" xmlns:v="urn:schemas-microsoft-com:vml" xmlns:wp14="http://schemas.microsoft.com/office/word/2010/wordprocessingDrawing" xmlns:wp="http://schemas.openxmlformats.org/drawingml/2006/wordprocessingDrawing" xmlns:w10="urn:schemas-microsoft-com:office:word" xmlns:w="http://schemas.openxmlformats.org/wordprocessingml/2006/main" xmlns:w14="http://schemas.microsoft.com/office/word/2010/wordml" xmlns:w15="http://schemas.microsoft.com/office/word/2012/wordml" xmlns:w16cex="http://schemas.microsoft.com/office/word/2018/wordml/cex" xmlns:w16cid="http://schemas.microsoft.com/office/word/2016/wordml/cid" xmlns:w16="http://schemas.microsoft.com/office/word/2018/wordml" xmlns:w16du="http://schemas.microsoft.com/office/word/2023/wordml/word16du" xmlns:w16sdtdh="http://schemas.microsoft.com/office/word/2020/wordml/sdtdatahash" xmlns:w16sdtfl="http://schemas.microsoft.com/office/word/2024/wordml/sdtformatlock" xmlns:w16se="http://schemas.microsoft.com/office/word/2015/wordml/symex" xmlns:wpg="http://schemas.microsoft.com/office/word/2010/wordprocessingGroup" xmlns:wpi="http://schemas.microsoft.com/office/word/2010/wordprocessingInk" xmlns:wne="http://schemas.microsoft.com/office/word/2006/wordml" xmlns:wps="http://schemas.microsoft.com/office/word/2010/wordprocessingShape" mc:Ignorable="w14 w15 w16se w16cid w16 w16cex w16sdtdh w16sdtfl w16du wp14">
   <w:abstractNum w:abstractNumId="0" w15:restartNumberingAfterBreak="0">
+    <w:nsid w:val="0A69104D"/>
+    <w:multiLevelType w:val="multilevel"/>
+    <w:tmpl w:val="F508D1D4"/>
+    <w:lvl w:ilvl="0">
+      <w:start w:val="1"/>
+      <w:numFmt w:val="decimal"/>
+      <w:lvlText w:val="%1."/>
+      <w:lvlJc w:val="left"/>
+      <w:pPr>
+        <w:tabs>
+          <w:tab w:val="num" w:pos="720"/>
+        </w:tabs>
+        <w:ind w:left="720" w:hanging="360"/>
+      </w:pPr>
+    </w:lvl>
+    <w:lvl w:ilvl="1" w:tentative="1">
+      <w:start w:val="1"/>
+      <w:numFmt w:val="decimal"/>
+      <w:lvlText w:val="%2."/>
+      <w:lvlJc w:val="left"/>
+      <w:pPr>
+        <w:tabs>
+          <w:tab w:val="num" w:pos="1440"/>
+        </w:tabs>
+        <w:ind w:left="1440" w:hanging="360"/>
+      </w:pPr>
+    </w:lvl>
+    <w:lvl w:ilvl="2" w:tentative="1">
+      <w:start w:val="1"/>
+      <w:numFmt w:val="decimal"/>
+      <w:lvlText w:val="%3."/>
+      <w:lvlJc w:val="left"/>
+      <w:pPr>
+        <w:tabs>
+          <w:tab w:val="num" w:pos="2160"/>
+        </w:tabs>
+        <w:ind w:left="2160" w:hanging="360"/>
+      </w:pPr>
+    </w:lvl>
+    <w:lvl w:ilvl="3" w:tentative="1">
+      <w:start w:val="1"/>
+      <w:numFmt w:val="decimal"/>
+      <w:lvlText w:val="%4."/>
+      <w:lvlJc w:val="left"/>
+      <w:pPr>
+        <w:tabs>
+          <w:tab w:val="num" w:pos="2880"/>
+        </w:tabs>
+        <w:ind w:left="2880" w:hanging="360"/>
+      </w:pPr>
+    </w:lvl>
+    <w:lvl w:ilvl="4" w:tentative="1">
+      <w:start w:val="1"/>
+      <w:numFmt w:val="decimal"/>
+      <w:lvlText w:val="%5."/>
+      <w:lvlJc w:val="left"/>
+      <w:pPr>
+        <w:tabs>
+          <w:tab w:val="num" w:pos="3600"/>
+        </w:tabs>
+        <w:ind w:left="3600" w:hanging="360"/>
+      </w:pPr>
+    </w:lvl>
+    <w:lvl w:ilvl="5" w:tentative="1">
+      <w:start w:val="1"/>
+      <w:numFmt w:val="decimal"/>
+      <w:lvlText w:val="%6."/>
+      <w:lvlJc w:val="left"/>
+      <w:pPr>
+        <w:tabs>
+          <w:tab w:val="num" w:pos="4320"/>
+        </w:tabs>
+        <w:ind w:left="4320" w:hanging="360"/>
+      </w:pPr>
+    </w:lvl>
+    <w:lvl w:ilvl="6" w:tentative="1">
+      <w:start w:val="1"/>
+      <w:numFmt w:val="decimal"/>
+      <w:lvlText w:val="%7."/>
+      <w:lvlJc w:val="left"/>
+      <w:pPr>
+        <w:tabs>
+          <w:tab w:val="num" w:pos="5040"/>
+        </w:tabs>
+        <w:ind w:left="5040" w:hanging="360"/>
+      </w:pPr>
+    </w:lvl>
+    <w:lvl w:ilvl="7" w:tentative="1">
+      <w:start w:val="1"/>
+      <w:numFmt w:val="decimal"/>
+      <w:lvlText w:val="%8."/>
+      <w:lvlJc w:val="left"/>
+      <w:pPr>
+        <w:tabs>
+          <w:tab w:val="num" w:pos="5760"/>
+        </w:tabs>
+        <w:ind w:left="5760" w:hanging="360"/>
+      </w:pPr>
+    </w:lvl>
+    <w:lvl w:ilvl="8" w:tentative="1">
+      <w:start w:val="1"/>
+      <w:numFmt w:val="decimal"/>
+      <w:lvlText w:val="%9."/>
+      <w:lvlJc w:val="left"/>
+      <w:pPr>
+        <w:tabs>
+          <w:tab w:val="num" w:pos="6480"/>
+        </w:tabs>
+        <w:ind w:left="6480" w:hanging="360"/>
+      </w:pPr>
+    </w:lvl>
+  </w:abstractNum>
+  <w:abstractNum w:abstractNumId="1" w15:restartNumberingAfterBreak="0">
     <w:nsid w:val="0EBB5AF5"/>
     <w:multiLevelType w:val="hybridMultilevel"/>
     <w:tmpl w:val="58A8A6B2"/>
@@ -1223,7 +2404,7 @@
       </w:rPr>
     </w:lvl>
   </w:abstractNum>
-  <w:abstractNum w:abstractNumId="1" w15:restartNumberingAfterBreak="0">
+  <w:abstractNum w:abstractNumId="2" w15:restartNumberingAfterBreak="0">
     <w:nsid w:val="13264E16"/>
     <w:multiLevelType w:val="hybridMultilevel"/>
     <w:tmpl w:val="EAEE43AA"/>
@@ -1336,7 +2517,7 @@
       </w:rPr>
     </w:lvl>
   </w:abstractNum>
-  <w:abstractNum w:abstractNumId="2" w15:restartNumberingAfterBreak="0">
+  <w:abstractNum w:abstractNumId="3" w15:restartNumberingAfterBreak="0">
     <w:nsid w:val="1F4D0B01"/>
     <w:multiLevelType w:val="hybridMultilevel"/>
     <w:tmpl w:val="A1604D06"/>
@@ -1449,7 +2630,7 @@
       </w:rPr>
     </w:lvl>
   </w:abstractNum>
-  <w:abstractNum w:abstractNumId="3" w15:restartNumberingAfterBreak="0">
+  <w:abstractNum w:abstractNumId="4" w15:restartNumberingAfterBreak="0">
     <w:nsid w:val="22D85E7B"/>
     <w:multiLevelType w:val="hybridMultilevel"/>
     <w:tmpl w:val="E26274B0"/>
@@ -1562,7 +2743,7 @@
       </w:rPr>
     </w:lvl>
   </w:abstractNum>
-  <w:abstractNum w:abstractNumId="4" w15:restartNumberingAfterBreak="0">
+  <w:abstractNum w:abstractNumId="5" w15:restartNumberingAfterBreak="0">
     <w:nsid w:val="27B452B6"/>
     <w:multiLevelType w:val="hybridMultilevel"/>
     <w:tmpl w:val="AAE21968"/>
@@ -1675,7 +2856,7 @@
       </w:rPr>
     </w:lvl>
   </w:abstractNum>
-  <w:abstractNum w:abstractNumId="5" w15:restartNumberingAfterBreak="0">
+  <w:abstractNum w:abstractNumId="6" w15:restartNumberingAfterBreak="0">
     <w:nsid w:val="299A3C2B"/>
     <w:multiLevelType w:val="hybridMultilevel"/>
     <w:tmpl w:val="E7100E96"/>
@@ -1788,7 +2969,7 @@
       </w:rPr>
     </w:lvl>
   </w:abstractNum>
-  <w:abstractNum w:abstractNumId="6" w15:restartNumberingAfterBreak="0">
+  <w:abstractNum w:abstractNumId="7" w15:restartNumberingAfterBreak="0">
     <w:nsid w:val="34572D29"/>
     <w:multiLevelType w:val="hybridMultilevel"/>
     <w:tmpl w:val="72FE17B8"/>
@@ -1901,7 +3082,7 @@
       </w:rPr>
     </w:lvl>
   </w:abstractNum>
-  <w:abstractNum w:abstractNumId="7" w15:restartNumberingAfterBreak="0">
+  <w:abstractNum w:abstractNumId="8" w15:restartNumberingAfterBreak="0">
     <w:nsid w:val="3502470D"/>
     <w:multiLevelType w:val="hybridMultilevel"/>
     <w:tmpl w:val="21C85BA8"/>
@@ -1987,7 +3168,7 @@
       </w:pPr>
     </w:lvl>
   </w:abstractNum>
-  <w:abstractNum w:abstractNumId="8" w15:restartNumberingAfterBreak="0">
+  <w:abstractNum w:abstractNumId="9" w15:restartNumberingAfterBreak="0">
     <w:nsid w:val="3B045214"/>
     <w:multiLevelType w:val="hybridMultilevel"/>
     <w:tmpl w:val="24229CEE"/>
@@ -2073,7 +3254,7 @@
       </w:pPr>
     </w:lvl>
   </w:abstractNum>
-  <w:abstractNum w:abstractNumId="9" w15:restartNumberingAfterBreak="0">
+  <w:abstractNum w:abstractNumId="10" w15:restartNumberingAfterBreak="0">
     <w:nsid w:val="4309797B"/>
     <w:multiLevelType w:val="hybridMultilevel"/>
     <w:tmpl w:val="47501A2A"/>
@@ -2213,7 +3394,120 @@
       </w:rPr>
     </w:lvl>
   </w:abstractNum>
-  <w:abstractNum w:abstractNumId="10" w15:restartNumberingAfterBreak="0">
+  <w:abstractNum w:abstractNumId="11" w15:restartNumberingAfterBreak="0">
+    <w:nsid w:val="6A0A3F1A"/>
+    <w:multiLevelType w:val="multilevel"/>
+    <w:tmpl w:val="251AD956"/>
+    <w:lvl w:ilvl="0">
+      <w:start w:val="1"/>
+      <w:numFmt w:val="decimal"/>
+      <w:lvlText w:val="%1."/>
+      <w:lvlJc w:val="left"/>
+      <w:pPr>
+        <w:tabs>
+          <w:tab w:val="num" w:pos="720"/>
+        </w:tabs>
+        <w:ind w:left="720" w:hanging="360"/>
+      </w:pPr>
+    </w:lvl>
+    <w:lvl w:ilvl="1" w:tentative="1">
+      <w:start w:val="1"/>
+      <w:numFmt w:val="decimal"/>
+      <w:lvlText w:val="%2."/>
+      <w:lvlJc w:val="left"/>
+      <w:pPr>
+        <w:tabs>
+          <w:tab w:val="num" w:pos="1440"/>
+        </w:tabs>
+        <w:ind w:left="1440" w:hanging="360"/>
+      </w:pPr>
+    </w:lvl>
+    <w:lvl w:ilvl="2" w:tentative="1">
+      <w:start w:val="1"/>
+      <w:numFmt w:val="decimal"/>
+      <w:lvlText w:val="%3."/>
+      <w:lvlJc w:val="left"/>
+      <w:pPr>
+        <w:tabs>
+          <w:tab w:val="num" w:pos="2160"/>
+        </w:tabs>
+        <w:ind w:left="2160" w:hanging="360"/>
+      </w:pPr>
+    </w:lvl>
+    <w:lvl w:ilvl="3" w:tentative="1">
+      <w:start w:val="1"/>
+      <w:numFmt w:val="decimal"/>
+      <w:lvlText w:val="%4."/>
+      <w:lvlJc w:val="left"/>
+      <w:pPr>
+        <w:tabs>
+          <w:tab w:val="num" w:pos="2880"/>
+        </w:tabs>
+        <w:ind w:left="2880" w:hanging="360"/>
+      </w:pPr>
+    </w:lvl>
+    <w:lvl w:ilvl="4" w:tentative="1">
+      <w:start w:val="1"/>
+      <w:numFmt w:val="decimal"/>
+      <w:lvlText w:val="%5."/>
+      <w:lvlJc w:val="left"/>
+      <w:pPr>
+        <w:tabs>
+          <w:tab w:val="num" w:pos="3600"/>
+        </w:tabs>
+        <w:ind w:left="3600" w:hanging="360"/>
+      </w:pPr>
+    </w:lvl>
+    <w:lvl w:ilvl="5" w:tentative="1">
+      <w:start w:val="1"/>
+      <w:numFmt w:val="decimal"/>
+      <w:lvlText w:val="%6."/>
+      <w:lvlJc w:val="left"/>
+      <w:pPr>
+        <w:tabs>
+          <w:tab w:val="num" w:pos="4320"/>
+        </w:tabs>
+        <w:ind w:left="4320" w:hanging="360"/>
+      </w:pPr>
+    </w:lvl>
+    <w:lvl w:ilvl="6" w:tentative="1">
+      <w:start w:val="1"/>
+      <w:numFmt w:val="decimal"/>
+      <w:lvlText w:val="%7."/>
+      <w:lvlJc w:val="left"/>
+      <w:pPr>
+        <w:tabs>
+          <w:tab w:val="num" w:pos="5040"/>
+        </w:tabs>
+        <w:ind w:left="5040" w:hanging="360"/>
+      </w:pPr>
+    </w:lvl>
+    <w:lvl w:ilvl="7" w:tentative="1">
+      <w:start w:val="1"/>
+      <w:numFmt w:val="decimal"/>
+      <w:lvlText w:val="%8."/>
+      <w:lvlJc w:val="left"/>
+      <w:pPr>
+        <w:tabs>
+          <w:tab w:val="num" w:pos="5760"/>
+        </w:tabs>
+        <w:ind w:left="5760" w:hanging="360"/>
+      </w:pPr>
+    </w:lvl>
+    <w:lvl w:ilvl="8" w:tentative="1">
+      <w:start w:val="1"/>
+      <w:numFmt w:val="decimal"/>
+      <w:lvlText w:val="%9."/>
+      <w:lvlJc w:val="left"/>
+      <w:pPr>
+        <w:tabs>
+          <w:tab w:val="num" w:pos="6480"/>
+        </w:tabs>
+        <w:ind w:left="6480" w:hanging="360"/>
+      </w:pPr>
+    </w:lvl>
+  </w:abstractNum>
+  <w:abstractNum w:abstractNumId="12" w15:restartNumberingAfterBreak="0">
     <w:nsid w:val="6A0E7244"/>
     <w:multiLevelType w:val="hybridMultilevel"/>
     <w:tmpl w:val="EC366770"/>
@@ -2326,7 +3620,7 @@
       </w:rPr>
     </w:lvl>
   </w:abstractNum>
-  <w:abstractNum w:abstractNumId="11" w15:restartNumberingAfterBreak="0">
+  <w:abstractNum w:abstractNumId="13" w15:restartNumberingAfterBreak="0">
     <w:nsid w:val="6B1E1E98"/>
     <w:multiLevelType w:val="hybridMultilevel"/>
     <w:tmpl w:val="AF8C1094"/>
@@ -2412,7 +3706,7 @@
       </w:pPr>
     </w:lvl>
   </w:abstractNum>
-  <w:abstractNum w:abstractNumId="12" w15:restartNumberingAfterBreak="0">
+  <w:abstractNum w:abstractNumId="14" w15:restartNumberingAfterBreak="0">
     <w:nsid w:val="6B9924BC"/>
     <w:multiLevelType w:val="hybridMultilevel"/>
     <w:tmpl w:val="0C36B6CE"/>
@@ -2525,7 +3819,7 @@
       </w:rPr>
     </w:lvl>
   </w:abstractNum>
-  <w:abstractNum w:abstractNumId="13" w15:restartNumberingAfterBreak="0">
+  <w:abstractNum w:abstractNumId="15" w15:restartNumberingAfterBreak="0">
     <w:nsid w:val="6F7F3AE3"/>
     <w:multiLevelType w:val="hybridMultilevel"/>
     <w:tmpl w:val="9B72D528"/>
@@ -2665,7 +3959,233 @@
       </w:rPr>
     </w:lvl>
   </w:abstractNum>
-  <w:abstractNum w:abstractNumId="14" w15:restartNumberingAfterBreak="0">
+  <w:abstractNum w:abstractNumId="16" w15:restartNumberingAfterBreak="0">
+    <w:nsid w:val="72A3357C"/>
+    <w:multiLevelType w:val="multilevel"/>
+    <w:tmpl w:val="1182F584"/>
+    <w:lvl w:ilvl="0">
+      <w:start w:val="1"/>
+      <w:numFmt w:val="decimal"/>
+      <w:lvlText w:val="%1."/>
+      <w:lvlJc w:val="left"/>
+      <w:pPr>
+        <w:tabs>
+          <w:tab w:val="num" w:pos="720"/>
+        </w:tabs>
+        <w:ind w:left="720" w:hanging="360"/>
+      </w:pPr>
+    </w:lvl>
+    <w:lvl w:ilvl="1" w:tentative="1">
+      <w:start w:val="1"/>
+      <w:numFmt w:val="decimal"/>
+      <w:lvlText w:val="%2."/>
+      <w:lvlJc w:val="left"/>
+      <w:pPr>
+        <w:tabs>
+          <w:tab w:val="num" w:pos="1440"/>
+        </w:tabs>
+        <w:ind w:left="1440" w:hanging="360"/>
+      </w:pPr>
+    </w:lvl>
+    <w:lvl w:ilvl="2" w:tentative="1">
+      <w:start w:val="1"/>
+      <w:numFmt w:val="decimal"/>
+      <w:lvlText w:val="%3."/>
+      <w:lvlJc w:val="left"/>
+      <w:pPr>
+        <w:tabs>
+          <w:tab w:val="num" w:pos="2160"/>
+        </w:tabs>
+        <w:ind w:left="2160" w:hanging="360"/>
+      </w:pPr>
+    </w:lvl>
+    <w:lvl w:ilvl="3" w:tentative="1">
+      <w:start w:val="1"/>
+      <w:numFmt w:val="decimal"/>
+      <w:lvlText w:val="%4."/>
+      <w:lvlJc w:val="left"/>
+      <w:pPr>
+        <w:tabs>
+          <w:tab w:val="num" w:pos="2880"/>
+        </w:tabs>
+        <w:ind w:left="2880" w:hanging="360"/>
+      </w:pPr>
+    </w:lvl>
+    <w:lvl w:ilvl="4" w:tentative="1">
+      <w:start w:val="1"/>
+      <w:numFmt w:val="decimal"/>
+      <w:lvlText w:val="%5."/>
+      <w:lvlJc w:val="left"/>
+      <w:pPr>
+        <w:tabs>
+          <w:tab w:val="num" w:pos="3600"/>
+        </w:tabs>
+        <w:ind w:left="3600" w:hanging="360"/>
+      </w:pPr>
+    </w:lvl>
+    <w:lvl w:ilvl="5" w:tentative="1">
+      <w:start w:val="1"/>
+      <w:numFmt w:val="decimal"/>
+      <w:lvlText w:val="%6."/>
+      <w:lvlJc w:val="left"/>
+      <w:pPr>
+        <w:tabs>
+          <w:tab w:val="num" w:pos="4320"/>
+        </w:tabs>
+        <w:ind w:left="4320" w:hanging="360"/>
+      </w:pPr>
+    </w:lvl>
+    <w:lvl w:ilvl="6" w:tentative="1">
+      <w:start w:val="1"/>
+      <w:numFmt w:val="decimal"/>
+      <w:lvlText w:val="%7."/>
+      <w:lvlJc w:val="left"/>
+      <w:pPr>
+        <w:tabs>
+          <w:tab w:val="num" w:pos="5040"/>
+        </w:tabs>
+        <w:ind w:left="5040" w:hanging="360"/>
+      </w:pPr>
+    </w:lvl>
+    <w:lvl w:ilvl="7" w:tentative="1">
+      <w:start w:val="1"/>
+      <w:numFmt w:val="decimal"/>
+      <w:lvlText w:val="%8."/>
+      <w:lvlJc w:val="left"/>
+      <w:pPr>
+        <w:tabs>
+          <w:tab w:val="num" w:pos="5760"/>
+        </w:tabs>
+        <w:ind w:left="5760" w:hanging="360"/>
+      </w:pPr>
+    </w:lvl>
+    <w:lvl w:ilvl="8" w:tentative="1">
+      <w:start w:val="1"/>
+      <w:numFmt w:val="decimal"/>
+      <w:lvlText w:val="%9."/>
+      <w:lvlJc w:val="left"/>
+      <w:pPr>
+        <w:tabs>
+          <w:tab w:val="num" w:pos="6480"/>
+        </w:tabs>
+        <w:ind w:left="6480" w:hanging="360"/>
+      </w:pPr>
+    </w:lvl>
+  </w:abstractNum>
+  <w:abstractNum w:abstractNumId="17" w15:restartNumberingAfterBreak="0">
+    <w:nsid w:val="7CF46D89"/>
+    <w:multiLevelType w:val="multilevel"/>
+    <w:tmpl w:val="C20AA82C"/>
+    <w:lvl w:ilvl="0">
+      <w:start w:val="1"/>
+      <w:numFmt w:val="decimal"/>
+      <w:lvlText w:val="%1."/>
+      <w:lvlJc w:val="left"/>
+      <w:pPr>
+        <w:tabs>
+          <w:tab w:val="num" w:pos="720"/>
+        </w:tabs>
+        <w:ind w:left="720" w:hanging="360"/>
+      </w:pPr>
+    </w:lvl>
+    <w:lvl w:ilvl="1" w:tentative="1">
+      <w:start w:val="1"/>
+      <w:numFmt w:val="decimal"/>
+      <w:lvlText w:val="%2."/>
+      <w:lvlJc w:val="left"/>
+      <w:pPr>
+        <w:tabs>
+          <w:tab w:val="num" w:pos="1440"/>
+        </w:tabs>
+        <w:ind w:left="1440" w:hanging="360"/>
+      </w:pPr>
+    </w:lvl>
+    <w:lvl w:ilvl="2" w:tentative="1">
+      <w:start w:val="1"/>
+      <w:numFmt w:val="decimal"/>
+      <w:lvlText w:val="%3."/>
+      <w:lvlJc w:val="left"/>
+      <w:pPr>
+        <w:tabs>
+          <w:tab w:val="num" w:pos="2160"/>
+        </w:tabs>
+        <w:ind w:left="2160" w:hanging="360"/>
+      </w:pPr>
+    </w:lvl>
+    <w:lvl w:ilvl="3" w:tentative="1">
+      <w:start w:val="1"/>
+      <w:numFmt w:val="decimal"/>
+      <w:lvlText w:val="%4."/>
+      <w:lvlJc w:val="left"/>
+      <w:pPr>
+        <w:tabs>
+          <w:tab w:val="num" w:pos="2880"/>
+        </w:tabs>
+        <w:ind w:left="2880" w:hanging="360"/>
+      </w:pPr>
+    </w:lvl>
+    <w:lvl w:ilvl="4" w:tentative="1">
+      <w:start w:val="1"/>
+      <w:numFmt w:val="decimal"/>
+      <w:lvlText w:val="%5."/>
+      <w:lvlJc w:val="left"/>
+      <w:pPr>
+        <w:tabs>
+          <w:tab w:val="num" w:pos="3600"/>
+        </w:tabs>
+        <w:ind w:left="3600" w:hanging="360"/>
+      </w:pPr>
+    </w:lvl>
+    <w:lvl w:ilvl="5" w:tentative="1">
+      <w:start w:val="1"/>
+      <w:numFmt w:val="decimal"/>
+      <w:lvlText w:val="%6."/>
+      <w:lvlJc w:val="left"/>
+      <w:pPr>
+        <w:tabs>
+          <w:tab w:val="num" w:pos="4320"/>
+        </w:tabs>
+        <w:ind w:left="4320" w:hanging="360"/>
+      </w:pPr>
+    </w:lvl>
+    <w:lvl w:ilvl="6" w:tentative="1">
+      <w:start w:val="1"/>
+      <w:numFmt w:val="decimal"/>
+      <w:lvlText w:val="%7."/>
+      <w:lvlJc w:val="left"/>
+      <w:pPr>
+        <w:tabs>
+          <w:tab w:val="num" w:pos="5040"/>
+        </w:tabs>
+        <w:ind w:left="5040" w:hanging="360"/>
+      </w:pPr>
+    </w:lvl>
+    <w:lvl w:ilvl="7" w:tentative="1">
+      <w:start w:val="1"/>
+      <w:numFmt w:val="decimal"/>
+      <w:lvlText w:val="%8."/>
+      <w:lvlJc w:val="left"/>
+      <w:pPr>
+        <w:tabs>
+          <w:tab w:val="num" w:pos="5760"/>
+        </w:tabs>
+        <w:ind w:left="5760" w:hanging="360"/>
+      </w:pPr>
+    </w:lvl>
+    <w:lvl w:ilvl="8" w:tentative="1">
+      <w:start w:val="1"/>
+      <w:numFmt w:val="decimal"/>
+      <w:lvlText w:val="%9."/>
+      <w:lvlJc w:val="left"/>
+      <w:pPr>
+        <w:tabs>
+          <w:tab w:val="num" w:pos="6480"/>
+        </w:tabs>
+        <w:ind w:left="6480" w:hanging="360"/>
+      </w:pPr>
+    </w:lvl>
+  </w:abstractNum>
+  <w:abstractNum w:abstractNumId="18" w15:restartNumberingAfterBreak="0">
     <w:nsid w:val="7DFA25C3"/>
     <w:multiLevelType w:val="hybridMultilevel"/>
     <w:tmpl w:val="AF12CFB0"/>
@@ -2778,7 +4298,7 @@
       </w:rPr>
     </w:lvl>
   </w:abstractNum>
-  <w:abstractNum w:abstractNumId="15" w15:restartNumberingAfterBreak="0">
+  <w:abstractNum w:abstractNumId="19" w15:restartNumberingAfterBreak="0">
     <w:nsid w:val="7E721DBA"/>
     <w:multiLevelType w:val="hybridMultilevel"/>
     <w:tmpl w:val="332CACFE"/>
@@ -2918,60 +4438,72 @@
       </w:rPr>
     </w:lvl>
   </w:abstractNum>
-  <w:num w:numId="1">
+  <w:num w:numId="1" w16cid:durableId="583416998">
+    <w:abstractNumId w:val="4"/>
+  </w:num>
+  <w:num w:numId="2" w16cid:durableId="1322856226">
+    <w:abstractNumId w:val="9"/>
+  </w:num>
+  <w:num w:numId="3" w16cid:durableId="1262226913">
+    <w:abstractNumId w:val="6"/>
+  </w:num>
+  <w:num w:numId="4" w16cid:durableId="845361545">
+    <w:abstractNumId w:val="8"/>
+  </w:num>
+  <w:num w:numId="5" w16cid:durableId="191844980">
+    <w:abstractNumId w:val="12"/>
+  </w:num>
+  <w:num w:numId="6" w16cid:durableId="495345594">
+    <w:abstractNumId w:val="18"/>
+  </w:num>
+  <w:num w:numId="7" w16cid:durableId="493640763">
+    <w:abstractNumId w:val="1"/>
+  </w:num>
+  <w:num w:numId="8" w16cid:durableId="1597517483">
     <w:abstractNumId w:val="3"/>
   </w:num>
-  <w:num w:numId="2">
-    <w:abstractNumId w:val="8"/>
+  <w:num w:numId="9" w16cid:durableId="972717716">
+    <w:abstractNumId w:val="7"/>
   </w:num>
-  <w:num w:numId="3">
+  <w:num w:numId="10" w16cid:durableId="595016822">
+    <w:abstractNumId w:val="14"/>
+  </w:num>
+  <w:num w:numId="11" w16cid:durableId="1273515990">
+    <w:abstractNumId w:val="2"/>
+  </w:num>
+  <w:num w:numId="12" w16cid:durableId="632059126">
     <w:abstractNumId w:val="5"/>
   </w:num>
-  <w:num w:numId="4">
-    <w:abstractNumId w:val="7"/>
+  <w:num w:numId="13" w16cid:durableId="1933513617">
+    <w:abstractNumId w:val="15"/>
   </w:num>
-  <w:num w:numId="5">
+  <w:num w:numId="14" w16cid:durableId="645430480">
+    <w:abstractNumId w:val="19"/>
+  </w:num>
+  <w:num w:numId="15" w16cid:durableId="393937287">
     <w:abstractNumId w:val="10"/>
   </w:num>
-  <w:num w:numId="6">
-    <w:abstractNumId w:val="14"/>
-  </w:num>
-  <w:num w:numId="7">
-    <w:abstractNumId w:val="0"/>
-  </w:num>
-  <w:num w:numId="8">
-    <w:abstractNumId w:val="2"/>
-  </w:num>
-  <w:num w:numId="9">
-    <w:abstractNumId w:val="6"/>
-  </w:num>
-  <w:num w:numId="10">
-    <w:abstractNumId w:val="12"/>
-  </w:num>
-  <w:num w:numId="11">
-    <w:abstractNumId w:val="1"/>
-  </w:num>
-  <w:num w:numId="12">
-    <w:abstractNumId w:val="4"/>
-  </w:num>
-  <w:num w:numId="13">
+  <w:num w:numId="16" w16cid:durableId="1903827516">
     <w:abstractNumId w:val="13"/>
   </w:num>
-  <w:num w:numId="14">
-    <w:abstractNumId w:val="15"/>
+  <w:num w:numId="17" w16cid:durableId="773019049">
+    <w:abstractNumId w:val="16"/>
   </w:num>
-  <w:num w:numId="15">
-    <w:abstractNumId w:val="9"/>
+  <w:num w:numId="18" w16cid:durableId="613946905">
+    <w:abstractNumId w:val="17"/>
   </w:num>
-  <w:num w:numId="16">
+  <w:num w:numId="19" w16cid:durableId="766199825">
     <w:abstractNumId w:val="11"/>
+  </w:num>
+  <w:num w:numId="20" w16cid:durableId="702512115">
+    <w:abstractNumId w:val="0"/>
   </w:num>
   <w:numIdMacAtCleanup w:val="2"/>
 </w:numbering>
 </file>
 
 <file path=word/styles.xml><?xml version="1.0" encoding="utf-8"?>
-<w:styles xmlns:mc="http://schemas.openxmlformats.org/markup-compatibility/2006" xmlns:r="http://schemas.openxmlformats.org/officeDocument/2006/relationships" xmlns:w="http://schemas.openxmlformats.org/wordprocessingml/2006/main" xmlns:w14="http://schemas.microsoft.com/office/word/2010/wordml" xmlns:w15="http://schemas.microsoft.com/office/word/2012/wordml" xmlns:w16se="http://schemas.microsoft.com/office/word/2015/wordml/symex" mc:Ignorable="w14 w15 w16se">
+<w:styles xmlns:mc="http://schemas.openxmlformats.org/markup-compatibility/2006" xmlns:r="http://schemas.openxmlformats.org/officeDocument/2006/relationships" xmlns:w="http://schemas.openxmlformats.org/wordprocessingml/2006/main" xmlns:w14="http://schemas.microsoft.com/office/word/2010/wordml" xmlns:w15="http://schemas.microsoft.com/office/word/2012/wordml" xmlns:w16cex="http://schemas.microsoft.com/office/word/2018/wordml/cex" xmlns:w16cid="http://schemas.microsoft.com/office/word/2016/wordml/cid" xmlns:w16="http://schemas.microsoft.com/office/word/2018/wordml" xmlns:w16du="http://schemas.microsoft.com/office/word/2023/wordml/word16du" xmlns:w16sdtdh="http://schemas.microsoft.com/office/word/2020/wordml/sdtdatahash" xmlns:w16sdtfl="http://schemas.microsoft.com/office/word/2024/wordml/sdtformatlock" xmlns:w16se="http://schemas.microsoft.com/office/word/2015/wordml/symex" mc:Ignorable="w14 w15 w16se w16cid w16 w16cex w16sdtdh w16sdtfl w16du">
   <w:docDefaults>
     <w:rPrDefault>
       <w:rPr>
@@ -2981,7 +4513,7 @@
     </w:rPrDefault>
     <w:pPrDefault/>
   </w:docDefaults>
-  <w:latentStyles w:defLockedState="0" w:defUIPriority="99" w:defSemiHidden="0" w:defUnhideWhenUsed="0" w:defQFormat="0" w:count="371">
+  <w:latentStyles w:defLockedState="0" w:defUIPriority="99" w:defSemiHidden="0" w:defUnhideWhenUsed="0" w:defQFormat="0" w:count="376">
     <w:lsdException w:name="Normal" w:uiPriority="0" w:qFormat="1"/>
     <w:lsdException w:name="heading 1" w:uiPriority="9" w:qFormat="1"/>
     <w:lsdException w:name="heading 2" w:uiPriority="9" w:qFormat="1"/>
@@ -3353,6 +4885,11 @@
     <w:lsdException w:name="List Table 5 Dark Accent 6" w:uiPriority="50"/>
     <w:lsdException w:name="List Table 6 Colorful Accent 6" w:uiPriority="51"/>
     <w:lsdException w:name="List Table 7 Colorful Accent 6" w:uiPriority="52"/>
+    <w:lsdException w:name="Mention" w:semiHidden="1" w:unhideWhenUsed="1"/>
+    <w:lsdException w:name="Smart Hyperlink" w:semiHidden="1" w:unhideWhenUsed="1"/>
+    <w:lsdException w:name="Hashtag" w:semiHidden="1" w:unhideWhenUsed="1"/>
+    <w:lsdException w:name="Unresolved Mention" w:semiHidden="1" w:unhideWhenUsed="1"/>
+    <w:lsdException w:name="Smart Link" w:semiHidden="1" w:unhideWhenUsed="1"/>
   </w:latentStyles>
   <w:style w:type="paragraph" w:default="1" w:styleId="Normal">
     <w:name w:val="Normal"/>
@@ -3441,7 +4978,6 @@
   <w:style w:type="character" w:default="1" w:styleId="DefaultParagraphFont">
     <w:name w:val="Default Paragraph Font"/>
     <w:uiPriority w:val="1"/>
-    <w:semiHidden/>
     <w:unhideWhenUsed/>
   </w:style>
   <w:style w:type="table" w:default="1" w:styleId="TableNormal">

</xml_diff>